<commit_message>
docs(report): format all 10 image placeholders as explicit pattern guide boxes
</commit_message>
<xml_diff>
--- a/docs/lab-02/LAB2_SUBMISSION_REPORT_UPDATED.docx
+++ b/docs/lab-02/LAB2_SUBMISSION_REPORT_UPDATED.docx
@@ -1002,6 +1002,178 @@
         <w:t>, and all Acceptance Criteria are satisfied.</w:t>
       </w:r>
     </w:p>
+    <w:tbl>
+      <w:tblPr>
+        <w:tblW w:type="auto" w:w="0"/>
+        <w:jc w:val="center"/>
+        <w:tblLook w:firstColumn="1" w:firstRow="1" w:lastColumn="0" w:lastRow="0" w:noHBand="0" w:noVBand="1" w:val="04A0"/>
+      </w:tblPr>
+      <w:tblGrid>
+        <w:gridCol w:w="9360"/>
+      </w:tblGrid>
+      <w:tr>
+        <w:tc>
+          <w:tcPr>
+            <w:tcW w:type="dxa" w:w="9360"/>
+            <w:shd w:fill="F1F5F9"/>
+            <w:tcMar>
+              <w:top w:w="120" w:type="dxa"/>
+              <w:bottom w:w="120" w:type="dxa"/>
+              <w:left w:w="200" w:type="dxa"/>
+              <w:right w:w="200" w:type="dxa"/>
+            </w:tcMar>
+            <w:tcBorders>
+              <w:left w:val="single" w:sz="24" w:space="0" w:color="006B3C"/>
+              <w:top w:val="none"/>
+              <w:right w:val="none"/>
+              <w:bottom w:val="none"/>
+            </w:tcBorders>
+          </w:tcPr>
+          <w:p>
+            <w:pPr>
+              <w:spacing w:before="40" w:after="40" w:line="276" w:lineRule="auto"/>
+            </w:pPr>
+            <w:r>
+              <w:rPr>
+                <w:rFonts w:ascii="Consolas" w:hAnsi="Consolas"/>
+                <w:color w:val="1E293B"/>
+                <w:sz w:val="19"/>
+              </w:rPr>
+              <w:t xml:space="preserve">🖼️ **[กรอบสำหรับใส่รูปภาพที่ 1: GitHub Project Board]**  </w:t>
+            </w:r>
+          </w:p>
+        </w:tc>
+      </w:tr>
+    </w:tbl>
+    <w:tbl>
+      <w:tblPr>
+        <w:tblW w:type="auto" w:w="0"/>
+        <w:jc w:val="center"/>
+        <w:tblLook w:firstColumn="1" w:firstRow="1" w:lastColumn="0" w:lastRow="0" w:noHBand="0" w:noVBand="1" w:val="04A0"/>
+      </w:tblPr>
+      <w:tblGrid>
+        <w:gridCol w:w="9360"/>
+      </w:tblGrid>
+      <w:tr>
+        <w:tc>
+          <w:tcPr>
+            <w:tcW w:type="dxa" w:w="9360"/>
+            <w:shd w:fill="F1F5F9"/>
+            <w:tcMar>
+              <w:top w:w="120" w:type="dxa"/>
+              <w:bottom w:w="120" w:type="dxa"/>
+              <w:left w:w="200" w:type="dxa"/>
+              <w:right w:w="200" w:type="dxa"/>
+            </w:tcMar>
+            <w:tcBorders>
+              <w:left w:val="single" w:sz="24" w:space="0" w:color="006B3C"/>
+              <w:top w:val="none"/>
+              <w:right w:val="none"/>
+              <w:bottom w:val="none"/>
+            </w:tcBorders>
+          </w:tcPr>
+          <w:p>
+            <w:pPr>
+              <w:spacing w:before="40" w:after="40" w:line="276" w:lineRule="auto"/>
+            </w:pPr>
+            <w:r>
+              <w:rPr>
+                <w:rFonts w:ascii="Consolas" w:hAnsi="Consolas"/>
+                <w:color w:val="1E293B"/>
+                <w:sz w:val="19"/>
+              </w:rPr>
+              <w:t xml:space="preserve">- **คำอธิบาย**: หน้าจอ GitHub Project Kanban Board (มีคอลัมน์ Backlog, Specified, Started, PR Review, Fixing, Done)  </w:t>
+            </w:r>
+          </w:p>
+        </w:tc>
+      </w:tr>
+    </w:tbl>
+    <w:tbl>
+      <w:tblPr>
+        <w:tblW w:type="auto" w:w="0"/>
+        <w:jc w:val="center"/>
+        <w:tblLook w:firstColumn="1" w:firstRow="1" w:lastColumn="0" w:lastRow="0" w:noHBand="0" w:noVBand="1" w:val="04A0"/>
+      </w:tblPr>
+      <w:tblGrid>
+        <w:gridCol w:w="9360"/>
+      </w:tblGrid>
+      <w:tr>
+        <w:tc>
+          <w:tcPr>
+            <w:tcW w:type="dxa" w:w="9360"/>
+            <w:shd w:fill="F1F5F9"/>
+            <w:tcMar>
+              <w:top w:w="120" w:type="dxa"/>
+              <w:bottom w:w="120" w:type="dxa"/>
+              <w:left w:w="200" w:type="dxa"/>
+              <w:right w:w="200" w:type="dxa"/>
+            </w:tcMar>
+            <w:tcBorders>
+              <w:left w:val="single" w:sz="24" w:space="0" w:color="006B3C"/>
+              <w:top w:val="none"/>
+              <w:right w:val="none"/>
+              <w:bottom w:val="none"/>
+            </w:tcBorders>
+          </w:tcPr>
+          <w:p>
+            <w:pPr>
+              <w:spacing w:before="40" w:after="40" w:line="276" w:lineRule="auto"/>
+            </w:pPr>
+            <w:r>
+              <w:rPr>
+                <w:rFonts w:ascii="Consolas" w:hAnsi="Consolas"/>
+                <w:color w:val="1E293B"/>
+                <w:sz w:val="19"/>
+              </w:rPr>
+              <w:t xml:space="preserve">- **ที่มา**: [https://github.com/users/natthakamol1130/projects](https://github.com/users/natthakamol1130/projects)  </w:t>
+            </w:r>
+          </w:p>
+        </w:tc>
+      </w:tr>
+    </w:tbl>
+    <w:tbl>
+      <w:tblPr>
+        <w:tblW w:type="auto" w:w="0"/>
+        <w:jc w:val="center"/>
+        <w:tblLook w:firstColumn="1" w:firstRow="1" w:lastColumn="0" w:lastRow="0" w:noHBand="0" w:noVBand="1" w:val="04A0"/>
+      </w:tblPr>
+      <w:tblGrid>
+        <w:gridCol w:w="9360"/>
+      </w:tblGrid>
+      <w:tr>
+        <w:tc>
+          <w:tcPr>
+            <w:tcW w:type="dxa" w:w="9360"/>
+            <w:shd w:fill="F1F5F9"/>
+            <w:tcMar>
+              <w:top w:w="120" w:type="dxa"/>
+              <w:bottom w:w="120" w:type="dxa"/>
+              <w:left w:w="200" w:type="dxa"/>
+              <w:right w:w="200" w:type="dxa"/>
+            </w:tcMar>
+            <w:tcBorders>
+              <w:left w:val="single" w:sz="24" w:space="0" w:color="006B3C"/>
+              <w:top w:val="none"/>
+              <w:right w:val="none"/>
+              <w:bottom w:val="none"/>
+            </w:tcBorders>
+          </w:tcPr>
+          <w:p>
+            <w:pPr>
+              <w:spacing w:before="40" w:after="40" w:line="276" w:lineRule="auto"/>
+            </w:pPr>
+            <w:r>
+              <w:rPr>
+                <w:rFonts w:ascii="Consolas" w:hAnsi="Consolas"/>
+                <w:color w:val="1E293B"/>
+                <w:sz w:val="19"/>
+              </w:rPr>
+              <w:t>- **พาธรูปภาพ**: `images/01_kanban_board.png`</w:t>
+            </w:r>
+          </w:p>
+        </w:tc>
+      </w:tr>
+    </w:tbl>
     <w:p>
       <w:pPr>
         <w:spacing w:before="120" w:after="120"/>
@@ -1147,6 +1319,178 @@
               <w:t xml:space="preserve">| |/  </w:t>
               <w:br/>
               <w:t>| *   fb97b12 Merge pull request #26 from natthakamol1130/feature/7-create-ticket-ui</w:t>
+            </w:r>
+          </w:p>
+        </w:tc>
+      </w:tr>
+    </w:tbl>
+    <w:tbl>
+      <w:tblPr>
+        <w:tblW w:type="auto" w:w="0"/>
+        <w:jc w:val="center"/>
+        <w:tblLook w:firstColumn="1" w:firstRow="1" w:lastColumn="0" w:lastRow="0" w:noHBand="0" w:noVBand="1" w:val="04A0"/>
+      </w:tblPr>
+      <w:tblGrid>
+        <w:gridCol w:w="9360"/>
+      </w:tblGrid>
+      <w:tr>
+        <w:tc>
+          <w:tcPr>
+            <w:tcW w:type="dxa" w:w="9360"/>
+            <w:shd w:fill="F1F5F9"/>
+            <w:tcMar>
+              <w:top w:w="120" w:type="dxa"/>
+              <w:bottom w:w="120" w:type="dxa"/>
+              <w:left w:w="200" w:type="dxa"/>
+              <w:right w:w="200" w:type="dxa"/>
+            </w:tcMar>
+            <w:tcBorders>
+              <w:left w:val="single" w:sz="24" w:space="0" w:color="006B3C"/>
+              <w:top w:val="none"/>
+              <w:right w:val="none"/>
+              <w:bottom w:val="none"/>
+            </w:tcBorders>
+          </w:tcPr>
+          <w:p>
+            <w:pPr>
+              <w:spacing w:before="40" w:after="40" w:line="276" w:lineRule="auto"/>
+            </w:pPr>
+            <w:r>
+              <w:rPr>
+                <w:rFonts w:ascii="Consolas" w:hAnsi="Consolas"/>
+                <w:color w:val="1E293B"/>
+                <w:sz w:val="19"/>
+              </w:rPr>
+              <w:t xml:space="preserve">🖼️ **[กรอบสำหรับใส่รูปภาพที่ 2: Terminal Git Log Graph]**  </w:t>
+            </w:r>
+          </w:p>
+        </w:tc>
+      </w:tr>
+    </w:tbl>
+    <w:tbl>
+      <w:tblPr>
+        <w:tblW w:type="auto" w:w="0"/>
+        <w:jc w:val="center"/>
+        <w:tblLook w:firstColumn="1" w:firstRow="1" w:lastColumn="0" w:lastRow="0" w:noHBand="0" w:noVBand="1" w:val="04A0"/>
+      </w:tblPr>
+      <w:tblGrid>
+        <w:gridCol w:w="9360"/>
+      </w:tblGrid>
+      <w:tr>
+        <w:tc>
+          <w:tcPr>
+            <w:tcW w:type="dxa" w:w="9360"/>
+            <w:shd w:fill="F1F5F9"/>
+            <w:tcMar>
+              <w:top w:w="120" w:type="dxa"/>
+              <w:bottom w:w="120" w:type="dxa"/>
+              <w:left w:w="200" w:type="dxa"/>
+              <w:right w:w="200" w:type="dxa"/>
+            </w:tcMar>
+            <w:tcBorders>
+              <w:left w:val="single" w:sz="24" w:space="0" w:color="006B3C"/>
+              <w:top w:val="none"/>
+              <w:right w:val="none"/>
+              <w:bottom w:val="none"/>
+            </w:tcBorders>
+          </w:tcPr>
+          <w:p>
+            <w:pPr>
+              <w:spacing w:before="40" w:after="40" w:line="276" w:lineRule="auto"/>
+            </w:pPr>
+            <w:r>
+              <w:rPr>
+                <w:rFonts w:ascii="Consolas" w:hAnsi="Consolas"/>
+                <w:color w:val="1E293B"/>
+                <w:sz w:val="19"/>
+              </w:rPr>
+              <w:t xml:space="preserve">- **คำอธิบาย**: ผลลัพธ์การรันคำสั่ง `git log --oneline --graph -n 25` บนสาขา `main`  </w:t>
+            </w:r>
+          </w:p>
+        </w:tc>
+      </w:tr>
+    </w:tbl>
+    <w:tbl>
+      <w:tblPr>
+        <w:tblW w:type="auto" w:w="0"/>
+        <w:jc w:val="center"/>
+        <w:tblLook w:firstColumn="1" w:firstRow="1" w:lastColumn="0" w:lastRow="0" w:noHBand="0" w:noVBand="1" w:val="04A0"/>
+      </w:tblPr>
+      <w:tblGrid>
+        <w:gridCol w:w="9360"/>
+      </w:tblGrid>
+      <w:tr>
+        <w:tc>
+          <w:tcPr>
+            <w:tcW w:type="dxa" w:w="9360"/>
+            <w:shd w:fill="F1F5F9"/>
+            <w:tcMar>
+              <w:top w:w="120" w:type="dxa"/>
+              <w:bottom w:w="120" w:type="dxa"/>
+              <w:left w:w="200" w:type="dxa"/>
+              <w:right w:w="200" w:type="dxa"/>
+            </w:tcMar>
+            <w:tcBorders>
+              <w:left w:val="single" w:sz="24" w:space="0" w:color="006B3C"/>
+              <w:top w:val="none"/>
+              <w:right w:val="none"/>
+              <w:bottom w:val="none"/>
+            </w:tcBorders>
+          </w:tcPr>
+          <w:p>
+            <w:pPr>
+              <w:spacing w:before="40" w:after="40" w:line="276" w:lineRule="auto"/>
+            </w:pPr>
+            <w:r>
+              <w:rPr>
+                <w:rFonts w:ascii="Consolas" w:hAnsi="Consolas"/>
+                <w:color w:val="1E293B"/>
+                <w:sz w:val="19"/>
+              </w:rPr>
+              <w:t xml:space="preserve">- **ที่มา**: Terminal ใน VS Code (พิมพ์คำสั่ง `git log --oneline --graph -n 25`)  </w:t>
+            </w:r>
+          </w:p>
+        </w:tc>
+      </w:tr>
+    </w:tbl>
+    <w:tbl>
+      <w:tblPr>
+        <w:tblW w:type="auto" w:w="0"/>
+        <w:jc w:val="center"/>
+        <w:tblLook w:firstColumn="1" w:firstRow="1" w:lastColumn="0" w:lastRow="0" w:noHBand="0" w:noVBand="1" w:val="04A0"/>
+      </w:tblPr>
+      <w:tblGrid>
+        <w:gridCol w:w="9360"/>
+      </w:tblGrid>
+      <w:tr>
+        <w:tc>
+          <w:tcPr>
+            <w:tcW w:type="dxa" w:w="9360"/>
+            <w:shd w:fill="F1F5F9"/>
+            <w:tcMar>
+              <w:top w:w="120" w:type="dxa"/>
+              <w:bottom w:w="120" w:type="dxa"/>
+              <w:left w:w="200" w:type="dxa"/>
+              <w:right w:w="200" w:type="dxa"/>
+            </w:tcMar>
+            <w:tcBorders>
+              <w:left w:val="single" w:sz="24" w:space="0" w:color="006B3C"/>
+              <w:top w:val="none"/>
+              <w:right w:val="none"/>
+              <w:bottom w:val="none"/>
+            </w:tcBorders>
+          </w:tcPr>
+          <w:p>
+            <w:pPr>
+              <w:spacing w:before="40" w:after="40" w:line="276" w:lineRule="auto"/>
+            </w:pPr>
+            <w:r>
+              <w:rPr>
+                <w:rFonts w:ascii="Consolas" w:hAnsi="Consolas"/>
+                <w:color w:val="1E293B"/>
+                <w:sz w:val="19"/>
+              </w:rPr>
+              <w:t>- **พาธรูปภาพ**: `images/02_git_log_graph.png`</w:t>
             </w:r>
           </w:p>
         </w:tc>
@@ -2166,6 +2510,178 @@
         <w:t>README.md</w:t>
       </w:r>
     </w:p>
+    <w:tbl>
+      <w:tblPr>
+        <w:tblW w:type="auto" w:w="0"/>
+        <w:jc w:val="center"/>
+        <w:tblLook w:firstColumn="1" w:firstRow="1" w:lastColumn="0" w:lastRow="0" w:noHBand="0" w:noVBand="1" w:val="04A0"/>
+      </w:tblPr>
+      <w:tblGrid>
+        <w:gridCol w:w="9360"/>
+      </w:tblGrid>
+      <w:tr>
+        <w:tc>
+          <w:tcPr>
+            <w:tcW w:type="dxa" w:w="9360"/>
+            <w:shd w:fill="F1F5F9"/>
+            <w:tcMar>
+              <w:top w:w="120" w:type="dxa"/>
+              <w:bottom w:w="120" w:type="dxa"/>
+              <w:left w:w="200" w:type="dxa"/>
+              <w:right w:w="200" w:type="dxa"/>
+            </w:tcMar>
+            <w:tcBorders>
+              <w:left w:val="single" w:sz="24" w:space="0" w:color="006B3C"/>
+              <w:top w:val="none"/>
+              <w:right w:val="none"/>
+              <w:bottom w:val="none"/>
+            </w:tcBorders>
+          </w:tcPr>
+          <w:p>
+            <w:pPr>
+              <w:spacing w:before="40" w:after="40" w:line="276" w:lineRule="auto"/>
+            </w:pPr>
+            <w:r>
+              <w:rPr>
+                <w:rFonts w:ascii="Consolas" w:hAnsi="Consolas"/>
+                <w:color w:val="1E293B"/>
+                <w:sz w:val="19"/>
+              </w:rPr>
+              <w:t xml:space="preserve">🖼️ **[กรอบสำหรับใส่รูปภาพที่ 3: โครงสร้างไฟล์โปรเจกต์ File Explorer]**  </w:t>
+            </w:r>
+          </w:p>
+        </w:tc>
+      </w:tr>
+    </w:tbl>
+    <w:tbl>
+      <w:tblPr>
+        <w:tblW w:type="auto" w:w="0"/>
+        <w:jc w:val="center"/>
+        <w:tblLook w:firstColumn="1" w:firstRow="1" w:lastColumn="0" w:lastRow="0" w:noHBand="0" w:noVBand="1" w:val="04A0"/>
+      </w:tblPr>
+      <w:tblGrid>
+        <w:gridCol w:w="9360"/>
+      </w:tblGrid>
+      <w:tr>
+        <w:tc>
+          <w:tcPr>
+            <w:tcW w:type="dxa" w:w="9360"/>
+            <w:shd w:fill="F1F5F9"/>
+            <w:tcMar>
+              <w:top w:w="120" w:type="dxa"/>
+              <w:bottom w:w="120" w:type="dxa"/>
+              <w:left w:w="200" w:type="dxa"/>
+              <w:right w:w="200" w:type="dxa"/>
+            </w:tcMar>
+            <w:tcBorders>
+              <w:left w:val="single" w:sz="24" w:space="0" w:color="006B3C"/>
+              <w:top w:val="none"/>
+              <w:right w:val="none"/>
+              <w:bottom w:val="none"/>
+            </w:tcBorders>
+          </w:tcPr>
+          <w:p>
+            <w:pPr>
+              <w:spacing w:before="40" w:after="40" w:line="276" w:lineRule="auto"/>
+            </w:pPr>
+            <w:r>
+              <w:rPr>
+                <w:rFonts w:ascii="Consolas" w:hAnsi="Consolas"/>
+                <w:color w:val="1E293B"/>
+                <w:sz w:val="19"/>
+              </w:rPr>
+              <w:t xml:space="preserve">- **คำอธิบาย**: หน้าจอ VS Code File Explorer แสดงโฟลเดอร์ `docs/`, `client/`, `server/`, `prisma/`  </w:t>
+            </w:r>
+          </w:p>
+        </w:tc>
+      </w:tr>
+    </w:tbl>
+    <w:tbl>
+      <w:tblPr>
+        <w:tblW w:type="auto" w:w="0"/>
+        <w:jc w:val="center"/>
+        <w:tblLook w:firstColumn="1" w:firstRow="1" w:lastColumn="0" w:lastRow="0" w:noHBand="0" w:noVBand="1" w:val="04A0"/>
+      </w:tblPr>
+      <w:tblGrid>
+        <w:gridCol w:w="9360"/>
+      </w:tblGrid>
+      <w:tr>
+        <w:tc>
+          <w:tcPr>
+            <w:tcW w:type="dxa" w:w="9360"/>
+            <w:shd w:fill="F1F5F9"/>
+            <w:tcMar>
+              <w:top w:w="120" w:type="dxa"/>
+              <w:bottom w:w="120" w:type="dxa"/>
+              <w:left w:w="200" w:type="dxa"/>
+              <w:right w:w="200" w:type="dxa"/>
+            </w:tcMar>
+            <w:tcBorders>
+              <w:left w:val="single" w:sz="24" w:space="0" w:color="006B3C"/>
+              <w:top w:val="none"/>
+              <w:right w:val="none"/>
+              <w:bottom w:val="none"/>
+            </w:tcBorders>
+          </w:tcPr>
+          <w:p>
+            <w:pPr>
+              <w:spacing w:before="40" w:after="40" w:line="276" w:lineRule="auto"/>
+            </w:pPr>
+            <w:r>
+              <w:rPr>
+                <w:rFonts w:ascii="Consolas" w:hAnsi="Consolas"/>
+                <w:color w:val="1E293B"/>
+                <w:sz w:val="19"/>
+              </w:rPr>
+              <w:t xml:space="preserve">- **ที่มา**: VS Code ด้านซ้าย (แถบ Explorer)  </w:t>
+            </w:r>
+          </w:p>
+        </w:tc>
+      </w:tr>
+    </w:tbl>
+    <w:tbl>
+      <w:tblPr>
+        <w:tblW w:type="auto" w:w="0"/>
+        <w:jc w:val="center"/>
+        <w:tblLook w:firstColumn="1" w:firstRow="1" w:lastColumn="0" w:lastRow="0" w:noHBand="0" w:noVBand="1" w:val="04A0"/>
+      </w:tblPr>
+      <w:tblGrid>
+        <w:gridCol w:w="9360"/>
+      </w:tblGrid>
+      <w:tr>
+        <w:tc>
+          <w:tcPr>
+            <w:tcW w:type="dxa" w:w="9360"/>
+            <w:shd w:fill="F1F5F9"/>
+            <w:tcMar>
+              <w:top w:w="120" w:type="dxa"/>
+              <w:bottom w:w="120" w:type="dxa"/>
+              <w:left w:w="200" w:type="dxa"/>
+              <w:right w:w="200" w:type="dxa"/>
+            </w:tcMar>
+            <w:tcBorders>
+              <w:left w:val="single" w:sz="24" w:space="0" w:color="006B3C"/>
+              <w:top w:val="none"/>
+              <w:right w:val="none"/>
+              <w:bottom w:val="none"/>
+            </w:tcBorders>
+          </w:tcPr>
+          <w:p>
+            <w:pPr>
+              <w:spacing w:before="40" w:after="40" w:line="276" w:lineRule="auto"/>
+            </w:pPr>
+            <w:r>
+              <w:rPr>
+                <w:rFonts w:ascii="Consolas" w:hAnsi="Consolas"/>
+                <w:color w:val="1E293B"/>
+                <w:sz w:val="19"/>
+              </w:rPr>
+              <w:t>- **พาธรูปภาพ**: `images/03_directory_tree.png`</w:t>
+            </w:r>
+          </w:p>
+        </w:tc>
+      </w:tr>
+    </w:tbl>
     <w:p>
       <w:pPr>
         <w:spacing w:before="120" w:after="120"/>
@@ -2611,21 +3127,178 @@
         <w:t>8. GitHub Peer Review Evidence</w:t>
       </w:r>
     </w:p>
-    <w:p>
-      <w:pPr>
-        <w:pStyle w:val="Heading3"/>
-        <w:spacing w:before="200" w:after="40"/>
-      </w:pPr>
-      <w:r>
-        <w:rPr>
-          <w:rFonts w:ascii="Arial" w:hAnsi="Arial"/>
-          <w:b/>
-          <w:color w:val="475569"/>
-          <w:sz w:val="22"/>
-        </w:rPr>
-        <w:t>8.1 Peer Review Evidence on My Repository (Peer Reviewer @Suprawi5227 reviewing @natthakamol1130)</w:t>
-      </w:r>
-    </w:p>
+    <w:tbl>
+      <w:tblPr>
+        <w:tblW w:type="auto" w:w="0"/>
+        <w:jc w:val="center"/>
+        <w:tblLook w:firstColumn="1" w:firstRow="1" w:lastColumn="0" w:lastRow="0" w:noHBand="0" w:noVBand="1" w:val="04A0"/>
+      </w:tblPr>
+      <w:tblGrid>
+        <w:gridCol w:w="9360"/>
+      </w:tblGrid>
+      <w:tr>
+        <w:tc>
+          <w:tcPr>
+            <w:tcW w:type="dxa" w:w="9360"/>
+            <w:shd w:fill="F1F5F9"/>
+            <w:tcMar>
+              <w:top w:w="120" w:type="dxa"/>
+              <w:bottom w:w="120" w:type="dxa"/>
+              <w:left w:w="200" w:type="dxa"/>
+              <w:right w:w="200" w:type="dxa"/>
+            </w:tcMar>
+            <w:tcBorders>
+              <w:left w:val="single" w:sz="24" w:space="0" w:color="006B3C"/>
+              <w:top w:val="none"/>
+              <w:right w:val="none"/>
+              <w:bottom w:val="none"/>
+            </w:tcBorders>
+          </w:tcPr>
+          <w:p>
+            <w:pPr>
+              <w:spacing w:before="40" w:after="40" w:line="276" w:lineRule="auto"/>
+            </w:pPr>
+            <w:r>
+              <w:rPr>
+                <w:rFonts w:ascii="Consolas" w:hAnsi="Consolas"/>
+                <w:color w:val="1E293B"/>
+                <w:sz w:val="19"/>
+              </w:rPr>
+              <w:t xml:space="preserve">🖼️ **[กรอบสำหรับใส่รูปภาพที่ 9: หลักฐานที่เพื่อน (@Suprawi5227) รีวิวและกด Approve ให้เรา]**  </w:t>
+            </w:r>
+          </w:p>
+        </w:tc>
+      </w:tr>
+    </w:tbl>
+    <w:tbl>
+      <w:tblPr>
+        <w:tblW w:type="auto" w:w="0"/>
+        <w:jc w:val="center"/>
+        <w:tblLook w:firstColumn="1" w:firstRow="1" w:lastColumn="0" w:lastRow="0" w:noHBand="0" w:noVBand="1" w:val="04A0"/>
+      </w:tblPr>
+      <w:tblGrid>
+        <w:gridCol w:w="9360"/>
+      </w:tblGrid>
+      <w:tr>
+        <w:tc>
+          <w:tcPr>
+            <w:tcW w:type="dxa" w:w="9360"/>
+            <w:shd w:fill="F1F5F9"/>
+            <w:tcMar>
+              <w:top w:w="120" w:type="dxa"/>
+              <w:bottom w:w="120" w:type="dxa"/>
+              <w:left w:w="200" w:type="dxa"/>
+              <w:right w:w="200" w:type="dxa"/>
+            </w:tcMar>
+            <w:tcBorders>
+              <w:left w:val="single" w:sz="24" w:space="0" w:color="006B3C"/>
+              <w:top w:val="none"/>
+              <w:right w:val="none"/>
+              <w:bottom w:val="none"/>
+            </w:tcBorders>
+          </w:tcPr>
+          <w:p>
+            <w:pPr>
+              <w:spacing w:before="40" w:after="40" w:line="276" w:lineRule="auto"/>
+            </w:pPr>
+            <w:r>
+              <w:rPr>
+                <w:rFonts w:ascii="Consolas" w:hAnsi="Consolas"/>
+                <w:color w:val="1E293B"/>
+                <w:sz w:val="19"/>
+              </w:rPr>
+              <w:t xml:space="preserve">- **คำอธิบาย**: หน้าจอ Pull Request บน GitHub ของเราที่สุประวีณ์เข้ามารีวิวและกด Approve  </w:t>
+            </w:r>
+          </w:p>
+        </w:tc>
+      </w:tr>
+    </w:tbl>
+    <w:tbl>
+      <w:tblPr>
+        <w:tblW w:type="auto" w:w="0"/>
+        <w:jc w:val="center"/>
+        <w:tblLook w:firstColumn="1" w:firstRow="1" w:lastColumn="0" w:lastRow="0" w:noHBand="0" w:noVBand="1" w:val="04A0"/>
+      </w:tblPr>
+      <w:tblGrid>
+        <w:gridCol w:w="9360"/>
+      </w:tblGrid>
+      <w:tr>
+        <w:tc>
+          <w:tcPr>
+            <w:tcW w:type="dxa" w:w="9360"/>
+            <w:shd w:fill="F1F5F9"/>
+            <w:tcMar>
+              <w:top w:w="120" w:type="dxa"/>
+              <w:bottom w:w="120" w:type="dxa"/>
+              <w:left w:w="200" w:type="dxa"/>
+              <w:right w:w="200" w:type="dxa"/>
+            </w:tcMar>
+            <w:tcBorders>
+              <w:left w:val="single" w:sz="24" w:space="0" w:color="006B3C"/>
+              <w:top w:val="none"/>
+              <w:right w:val="none"/>
+              <w:bottom w:val="none"/>
+            </w:tcBorders>
+          </w:tcPr>
+          <w:p>
+            <w:pPr>
+              <w:spacing w:before="40" w:after="40" w:line="276" w:lineRule="auto"/>
+            </w:pPr>
+            <w:r>
+              <w:rPr>
+                <w:rFonts w:ascii="Consolas" w:hAnsi="Consolas"/>
+                <w:color w:val="1E293B"/>
+                <w:sz w:val="19"/>
+              </w:rPr>
+              <w:t xml:space="preserve">- **ที่มา**: [https://github.com/natthakamol1130/toktickit/pulls](https://github.com/natthakamol1130/toktickit/pulls)  </w:t>
+            </w:r>
+          </w:p>
+        </w:tc>
+      </w:tr>
+    </w:tbl>
+    <w:tbl>
+      <w:tblPr>
+        <w:tblW w:type="auto" w:w="0"/>
+        <w:jc w:val="center"/>
+        <w:tblLook w:firstColumn="1" w:firstRow="1" w:lastColumn="0" w:lastRow="0" w:noHBand="0" w:noVBand="1" w:val="04A0"/>
+      </w:tblPr>
+      <w:tblGrid>
+        <w:gridCol w:w="9360"/>
+      </w:tblGrid>
+      <w:tr>
+        <w:tc>
+          <w:tcPr>
+            <w:tcW w:type="dxa" w:w="9360"/>
+            <w:shd w:fill="F1F5F9"/>
+            <w:tcMar>
+              <w:top w:w="120" w:type="dxa"/>
+              <w:bottom w:w="120" w:type="dxa"/>
+              <w:left w:w="200" w:type="dxa"/>
+              <w:right w:w="200" w:type="dxa"/>
+            </w:tcMar>
+            <w:tcBorders>
+              <w:left w:val="single" w:sz="24" w:space="0" w:color="006B3C"/>
+              <w:top w:val="none"/>
+              <w:right w:val="none"/>
+              <w:bottom w:val="none"/>
+            </w:tcBorders>
+          </w:tcPr>
+          <w:p>
+            <w:pPr>
+              <w:spacing w:before="40" w:after="40" w:line="276" w:lineRule="auto"/>
+            </w:pPr>
+            <w:r>
+              <w:rPr>
+                <w:rFonts w:ascii="Consolas" w:hAnsi="Consolas"/>
+                <w:color w:val="1E293B"/>
+                <w:sz w:val="19"/>
+              </w:rPr>
+              <w:t>- **พาธรูปภาพ**: `images/09_peer_review_received.png`</w:t>
+            </w:r>
+          </w:p>
+        </w:tc>
+      </w:tr>
+    </w:tbl>
     <w:p>
       <w:pPr>
         <w:spacing w:before="120" w:after="120"/>
@@ -2666,21 +3339,178 @@
         </w:drawing>
       </w:r>
     </w:p>
-    <w:p>
-      <w:pPr>
-        <w:pStyle w:val="Heading3"/>
-        <w:spacing w:before="200" w:after="40"/>
-      </w:pPr>
-      <w:r>
-        <w:rPr>
-          <w:rFonts w:ascii="Arial" w:hAnsi="Arial"/>
-          <w:b/>
-          <w:color w:val="475569"/>
-          <w:sz w:val="22"/>
-        </w:rPr>
-        <w:t>8.2 Peer Review Evidence on Peer Repository (@natthakamol1130 reviewing @Suprawi5227)</w:t>
-      </w:r>
-    </w:p>
+    <w:tbl>
+      <w:tblPr>
+        <w:tblW w:type="auto" w:w="0"/>
+        <w:jc w:val="center"/>
+        <w:tblLook w:firstColumn="1" w:firstRow="1" w:lastColumn="0" w:lastRow="0" w:noHBand="0" w:noVBand="1" w:val="04A0"/>
+      </w:tblPr>
+      <w:tblGrid>
+        <w:gridCol w:w="9360"/>
+      </w:tblGrid>
+      <w:tr>
+        <w:tc>
+          <w:tcPr>
+            <w:tcW w:type="dxa" w:w="9360"/>
+            <w:shd w:fill="F1F5F9"/>
+            <w:tcMar>
+              <w:top w:w="120" w:type="dxa"/>
+              <w:bottom w:w="120" w:type="dxa"/>
+              <w:left w:w="200" w:type="dxa"/>
+              <w:right w:w="200" w:type="dxa"/>
+            </w:tcMar>
+            <w:tcBorders>
+              <w:left w:val="single" w:sz="24" w:space="0" w:color="006B3C"/>
+              <w:top w:val="none"/>
+              <w:right w:val="none"/>
+              <w:bottom w:val="none"/>
+            </w:tcBorders>
+          </w:tcPr>
+          <w:p>
+            <w:pPr>
+              <w:spacing w:before="40" w:after="40" w:line="276" w:lineRule="auto"/>
+            </w:pPr>
+            <w:r>
+              <w:rPr>
+                <w:rFonts w:ascii="Consolas" w:hAnsi="Consolas"/>
+                <w:color w:val="1E293B"/>
+                <w:sz w:val="19"/>
+              </w:rPr>
+              <w:t xml:space="preserve">🖼️ **[กรอบสำหรับใส่รูปภาพที่ 10: หลักฐานที่เรา (@natthakamol1130) ไปรีวิวและกด Approve ให้เพื่อน]**  </w:t>
+            </w:r>
+          </w:p>
+        </w:tc>
+      </w:tr>
+    </w:tbl>
+    <w:tbl>
+      <w:tblPr>
+        <w:tblW w:type="auto" w:w="0"/>
+        <w:jc w:val="center"/>
+        <w:tblLook w:firstColumn="1" w:firstRow="1" w:lastColumn="0" w:lastRow="0" w:noHBand="0" w:noVBand="1" w:val="04A0"/>
+      </w:tblPr>
+      <w:tblGrid>
+        <w:gridCol w:w="9360"/>
+      </w:tblGrid>
+      <w:tr>
+        <w:tc>
+          <w:tcPr>
+            <w:tcW w:type="dxa" w:w="9360"/>
+            <w:shd w:fill="F1F5F9"/>
+            <w:tcMar>
+              <w:top w:w="120" w:type="dxa"/>
+              <w:bottom w:w="120" w:type="dxa"/>
+              <w:left w:w="200" w:type="dxa"/>
+              <w:right w:w="200" w:type="dxa"/>
+            </w:tcMar>
+            <w:tcBorders>
+              <w:left w:val="single" w:sz="24" w:space="0" w:color="006B3C"/>
+              <w:top w:val="none"/>
+              <w:right w:val="none"/>
+              <w:bottom w:val="none"/>
+            </w:tcBorders>
+          </w:tcPr>
+          <w:p>
+            <w:pPr>
+              <w:spacing w:before="40" w:after="40" w:line="276" w:lineRule="auto"/>
+            </w:pPr>
+            <w:r>
+              <w:rPr>
+                <w:rFonts w:ascii="Consolas" w:hAnsi="Consolas"/>
+                <w:color w:val="1E293B"/>
+                <w:sz w:val="19"/>
+              </w:rPr>
+              <w:t xml:space="preserve">- **คำอธิบาย**: หน้าจอ Pull Request บน GitHub ของเพื่อนที่เราเข้าไปตรวจและกด Approve  </w:t>
+            </w:r>
+          </w:p>
+        </w:tc>
+      </w:tr>
+    </w:tbl>
+    <w:tbl>
+      <w:tblPr>
+        <w:tblW w:type="auto" w:w="0"/>
+        <w:jc w:val="center"/>
+        <w:tblLook w:firstColumn="1" w:firstRow="1" w:lastColumn="0" w:lastRow="0" w:noHBand="0" w:noVBand="1" w:val="04A0"/>
+      </w:tblPr>
+      <w:tblGrid>
+        <w:gridCol w:w="9360"/>
+      </w:tblGrid>
+      <w:tr>
+        <w:tc>
+          <w:tcPr>
+            <w:tcW w:type="dxa" w:w="9360"/>
+            <w:shd w:fill="F1F5F9"/>
+            <w:tcMar>
+              <w:top w:w="120" w:type="dxa"/>
+              <w:bottom w:w="120" w:type="dxa"/>
+              <w:left w:w="200" w:type="dxa"/>
+              <w:right w:w="200" w:type="dxa"/>
+            </w:tcMar>
+            <w:tcBorders>
+              <w:left w:val="single" w:sz="24" w:space="0" w:color="006B3C"/>
+              <w:top w:val="none"/>
+              <w:right w:val="none"/>
+              <w:bottom w:val="none"/>
+            </w:tcBorders>
+          </w:tcPr>
+          <w:p>
+            <w:pPr>
+              <w:spacing w:before="40" w:after="40" w:line="276" w:lineRule="auto"/>
+            </w:pPr>
+            <w:r>
+              <w:rPr>
+                <w:rFonts w:ascii="Consolas" w:hAnsi="Consolas"/>
+                <w:color w:val="1E293B"/>
+                <w:sz w:val="19"/>
+              </w:rPr>
+              <w:t xml:space="preserve">- **ที่มา**: Repository ของเพื่อน (`Suprawi5227/toktickit`)  </w:t>
+            </w:r>
+          </w:p>
+        </w:tc>
+      </w:tr>
+    </w:tbl>
+    <w:tbl>
+      <w:tblPr>
+        <w:tblW w:type="auto" w:w="0"/>
+        <w:jc w:val="center"/>
+        <w:tblLook w:firstColumn="1" w:firstRow="1" w:lastColumn="0" w:lastRow="0" w:noHBand="0" w:noVBand="1" w:val="04A0"/>
+      </w:tblPr>
+      <w:tblGrid>
+        <w:gridCol w:w="9360"/>
+      </w:tblGrid>
+      <w:tr>
+        <w:tc>
+          <w:tcPr>
+            <w:tcW w:type="dxa" w:w="9360"/>
+            <w:shd w:fill="F1F5F9"/>
+            <w:tcMar>
+              <w:top w:w="120" w:type="dxa"/>
+              <w:bottom w:w="120" w:type="dxa"/>
+              <w:left w:w="200" w:type="dxa"/>
+              <w:right w:w="200" w:type="dxa"/>
+            </w:tcMar>
+            <w:tcBorders>
+              <w:left w:val="single" w:sz="24" w:space="0" w:color="006B3C"/>
+              <w:top w:val="none"/>
+              <w:right w:val="none"/>
+              <w:bottom w:val="none"/>
+            </w:tcBorders>
+          </w:tcPr>
+          <w:p>
+            <w:pPr>
+              <w:spacing w:before="40" w:after="40" w:line="276" w:lineRule="auto"/>
+            </w:pPr>
+            <w:r>
+              <w:rPr>
+                <w:rFonts w:ascii="Consolas" w:hAnsi="Consolas"/>
+                <w:color w:val="1E293B"/>
+                <w:sz w:val="19"/>
+              </w:rPr>
+              <w:t>- **พาธรูปภาพ**: `images/10_peer_review_given.png`</w:t>
+            </w:r>
+          </w:p>
+        </w:tc>
+      </w:tr>
+    </w:tbl>
     <w:p>
       <w:pPr>
         <w:spacing w:before="120" w:after="120"/>
@@ -7011,6 +7841,178 @@
         </w:tc>
       </w:tr>
     </w:tbl>
+    <w:tbl>
+      <w:tblPr>
+        <w:tblW w:type="auto" w:w="0"/>
+        <w:jc w:val="center"/>
+        <w:tblLook w:firstColumn="1" w:firstRow="1" w:lastColumn="0" w:lastRow="0" w:noHBand="0" w:noVBand="1" w:val="04A0"/>
+      </w:tblPr>
+      <w:tblGrid>
+        <w:gridCol w:w="9360"/>
+      </w:tblGrid>
+      <w:tr>
+        <w:tc>
+          <w:tcPr>
+            <w:tcW w:type="dxa" w:w="9360"/>
+            <w:shd w:fill="F1F5F9"/>
+            <w:tcMar>
+              <w:top w:w="120" w:type="dxa"/>
+              <w:bottom w:w="120" w:type="dxa"/>
+              <w:left w:w="200" w:type="dxa"/>
+              <w:right w:w="200" w:type="dxa"/>
+            </w:tcMar>
+            <w:tcBorders>
+              <w:left w:val="single" w:sz="24" w:space="0" w:color="006B3C"/>
+              <w:top w:val="none"/>
+              <w:right w:val="none"/>
+              <w:bottom w:val="none"/>
+            </w:tcBorders>
+          </w:tcPr>
+          <w:p>
+            <w:pPr>
+              <w:spacing w:before="40" w:after="40" w:line="276" w:lineRule="auto"/>
+            </w:pPr>
+            <w:r>
+              <w:rPr>
+                <w:rFonts w:ascii="Consolas" w:hAnsi="Consolas"/>
+                <w:color w:val="1E293B"/>
+                <w:sz w:val="19"/>
+              </w:rPr>
+              <w:t xml:space="preserve">🖼️ **[กรอบสำหรับใส่รูปภาพที่ 4: Terminal Test Suite Results]**  </w:t>
+            </w:r>
+          </w:p>
+        </w:tc>
+      </w:tr>
+    </w:tbl>
+    <w:tbl>
+      <w:tblPr>
+        <w:tblW w:type="auto" w:w="0"/>
+        <w:jc w:val="center"/>
+        <w:tblLook w:firstColumn="1" w:firstRow="1" w:lastColumn="0" w:lastRow="0" w:noHBand="0" w:noVBand="1" w:val="04A0"/>
+      </w:tblPr>
+      <w:tblGrid>
+        <w:gridCol w:w="9360"/>
+      </w:tblGrid>
+      <w:tr>
+        <w:tc>
+          <w:tcPr>
+            <w:tcW w:type="dxa" w:w="9360"/>
+            <w:shd w:fill="F1F5F9"/>
+            <w:tcMar>
+              <w:top w:w="120" w:type="dxa"/>
+              <w:bottom w:w="120" w:type="dxa"/>
+              <w:left w:w="200" w:type="dxa"/>
+              <w:right w:w="200" w:type="dxa"/>
+            </w:tcMar>
+            <w:tcBorders>
+              <w:left w:val="single" w:sz="24" w:space="0" w:color="006B3C"/>
+              <w:top w:val="none"/>
+              <w:right w:val="none"/>
+              <w:bottom w:val="none"/>
+            </w:tcBorders>
+          </w:tcPr>
+          <w:p>
+            <w:pPr>
+              <w:spacing w:before="40" w:after="40" w:line="276" w:lineRule="auto"/>
+            </w:pPr>
+            <w:r>
+              <w:rPr>
+                <w:rFonts w:ascii="Consolas" w:hAnsi="Consolas"/>
+                <w:color w:val="1E293B"/>
+                <w:sz w:val="19"/>
+              </w:rPr>
+              <w:t xml:space="preserve">- **คำอธิบาย**: หน้าจอ Terminal แสดงการทดสอบผ่านครบ 100% (ทั้ง `npm test` ฝั่ง server และ `npx vitest run --environment jsdom` ฝั่ง client)  </w:t>
+            </w:r>
+          </w:p>
+        </w:tc>
+      </w:tr>
+    </w:tbl>
+    <w:tbl>
+      <w:tblPr>
+        <w:tblW w:type="auto" w:w="0"/>
+        <w:jc w:val="center"/>
+        <w:tblLook w:firstColumn="1" w:firstRow="1" w:lastColumn="0" w:lastRow="0" w:noHBand="0" w:noVBand="1" w:val="04A0"/>
+      </w:tblPr>
+      <w:tblGrid>
+        <w:gridCol w:w="9360"/>
+      </w:tblGrid>
+      <w:tr>
+        <w:tc>
+          <w:tcPr>
+            <w:tcW w:type="dxa" w:w="9360"/>
+            <w:shd w:fill="F1F5F9"/>
+            <w:tcMar>
+              <w:top w:w="120" w:type="dxa"/>
+              <w:bottom w:w="120" w:type="dxa"/>
+              <w:left w:w="200" w:type="dxa"/>
+              <w:right w:w="200" w:type="dxa"/>
+            </w:tcMar>
+            <w:tcBorders>
+              <w:left w:val="single" w:sz="24" w:space="0" w:color="006B3C"/>
+              <w:top w:val="none"/>
+              <w:right w:val="none"/>
+              <w:bottom w:val="none"/>
+            </w:tcBorders>
+          </w:tcPr>
+          <w:p>
+            <w:pPr>
+              <w:spacing w:before="40" w:after="40" w:line="276" w:lineRule="auto"/>
+            </w:pPr>
+            <w:r>
+              <w:rPr>
+                <w:rFonts w:ascii="Consolas" w:hAnsi="Consolas"/>
+                <w:color w:val="1E293B"/>
+                <w:sz w:val="19"/>
+              </w:rPr>
+              <w:t xml:space="preserve">- **ที่มา**: Terminal ใน VS Code  </w:t>
+            </w:r>
+          </w:p>
+        </w:tc>
+      </w:tr>
+    </w:tbl>
+    <w:tbl>
+      <w:tblPr>
+        <w:tblW w:type="auto" w:w="0"/>
+        <w:jc w:val="center"/>
+        <w:tblLook w:firstColumn="1" w:firstRow="1" w:lastColumn="0" w:lastRow="0" w:noHBand="0" w:noVBand="1" w:val="04A0"/>
+      </w:tblPr>
+      <w:tblGrid>
+        <w:gridCol w:w="9360"/>
+      </w:tblGrid>
+      <w:tr>
+        <w:tc>
+          <w:tcPr>
+            <w:tcW w:type="dxa" w:w="9360"/>
+            <w:shd w:fill="F1F5F9"/>
+            <w:tcMar>
+              <w:top w:w="120" w:type="dxa"/>
+              <w:bottom w:w="120" w:type="dxa"/>
+              <w:left w:w="200" w:type="dxa"/>
+              <w:right w:w="200" w:type="dxa"/>
+            </w:tcMar>
+            <w:tcBorders>
+              <w:left w:val="single" w:sz="24" w:space="0" w:color="006B3C"/>
+              <w:top w:val="none"/>
+              <w:right w:val="none"/>
+              <w:bottom w:val="none"/>
+            </w:tcBorders>
+          </w:tcPr>
+          <w:p>
+            <w:pPr>
+              <w:spacing w:before="40" w:after="40" w:line="276" w:lineRule="auto"/>
+            </w:pPr>
+            <w:r>
+              <w:rPr>
+                <w:rFonts w:ascii="Consolas" w:hAnsi="Consolas"/>
+                <w:color w:val="1E293B"/>
+                <w:sz w:val="19"/>
+              </w:rPr>
+              <w:t>- **พาธรูปภาพ**: `images/04_test_results.png`</w:t>
+            </w:r>
+          </w:p>
+        </w:tc>
+      </w:tr>
+    </w:tbl>
     <w:p>
       <w:pPr>
         <w:spacing w:before="120" w:after="120"/>
@@ -8157,6 +9159,178 @@
         <w:t>หน้าจอเลือกสิทธิ์ผู้ใช้งานจำลอง (Development Requester Selector) มี Dropdown และปุ่ม Continue</w:t>
       </w:r>
     </w:p>
+    <w:tbl>
+      <w:tblPr>
+        <w:tblW w:type="auto" w:w="0"/>
+        <w:jc w:val="center"/>
+        <w:tblLook w:firstColumn="1" w:firstRow="1" w:lastColumn="0" w:lastRow="0" w:noHBand="0" w:noVBand="1" w:val="04A0"/>
+      </w:tblPr>
+      <w:tblGrid>
+        <w:gridCol w:w="9360"/>
+      </w:tblGrid>
+      <w:tr>
+        <w:tc>
+          <w:tcPr>
+            <w:tcW w:type="dxa" w:w="9360"/>
+            <w:shd w:fill="F1F5F9"/>
+            <w:tcMar>
+              <w:top w:w="120" w:type="dxa"/>
+              <w:bottom w:w="120" w:type="dxa"/>
+              <w:left w:w="200" w:type="dxa"/>
+              <w:right w:w="200" w:type="dxa"/>
+            </w:tcMar>
+            <w:tcBorders>
+              <w:left w:val="single" w:sz="24" w:space="0" w:color="006B3C"/>
+              <w:top w:val="none"/>
+              <w:right w:val="none"/>
+              <w:bottom w:val="none"/>
+            </w:tcBorders>
+          </w:tcPr>
+          <w:p>
+            <w:pPr>
+              <w:spacing w:before="40" w:after="40" w:line="276" w:lineRule="auto"/>
+            </w:pPr>
+            <w:r>
+              <w:rPr>
+                <w:rFonts w:ascii="Consolas" w:hAnsi="Consolas"/>
+                <w:color w:val="1E293B"/>
+                <w:sz w:val="19"/>
+              </w:rPr>
+              <w:t xml:space="preserve">🖼️ **[กรอบสำหรับใส่รูปภาพที่ 5: Requester Selector Screen]**  </w:t>
+            </w:r>
+          </w:p>
+        </w:tc>
+      </w:tr>
+    </w:tbl>
+    <w:tbl>
+      <w:tblPr>
+        <w:tblW w:type="auto" w:w="0"/>
+        <w:jc w:val="center"/>
+        <w:tblLook w:firstColumn="1" w:firstRow="1" w:lastColumn="0" w:lastRow="0" w:noHBand="0" w:noVBand="1" w:val="04A0"/>
+      </w:tblPr>
+      <w:tblGrid>
+        <w:gridCol w:w="9360"/>
+      </w:tblGrid>
+      <w:tr>
+        <w:tc>
+          <w:tcPr>
+            <w:tcW w:type="dxa" w:w="9360"/>
+            <w:shd w:fill="F1F5F9"/>
+            <w:tcMar>
+              <w:top w:w="120" w:type="dxa"/>
+              <w:bottom w:w="120" w:type="dxa"/>
+              <w:left w:w="200" w:type="dxa"/>
+              <w:right w:w="200" w:type="dxa"/>
+            </w:tcMar>
+            <w:tcBorders>
+              <w:left w:val="single" w:sz="24" w:space="0" w:color="006B3C"/>
+              <w:top w:val="none"/>
+              <w:right w:val="none"/>
+              <w:bottom w:val="none"/>
+            </w:tcBorders>
+          </w:tcPr>
+          <w:p>
+            <w:pPr>
+              <w:spacing w:before="40" w:after="40" w:line="276" w:lineRule="auto"/>
+            </w:pPr>
+            <w:r>
+              <w:rPr>
+                <w:rFonts w:ascii="Consolas" w:hAnsi="Consolas"/>
+                <w:color w:val="1E293B"/>
+                <w:sz w:val="19"/>
+              </w:rPr>
+              <w:t xml:space="preserve">- **คำอธิบาย**: หน้าจอเลือกสิทธิ์ผู้ใช้งานจำลอง (Development Requester Selector)  </w:t>
+            </w:r>
+          </w:p>
+        </w:tc>
+      </w:tr>
+    </w:tbl>
+    <w:tbl>
+      <w:tblPr>
+        <w:tblW w:type="auto" w:w="0"/>
+        <w:jc w:val="center"/>
+        <w:tblLook w:firstColumn="1" w:firstRow="1" w:lastColumn="0" w:lastRow="0" w:noHBand="0" w:noVBand="1" w:val="04A0"/>
+      </w:tblPr>
+      <w:tblGrid>
+        <w:gridCol w:w="9360"/>
+      </w:tblGrid>
+      <w:tr>
+        <w:tc>
+          <w:tcPr>
+            <w:tcW w:type="dxa" w:w="9360"/>
+            <w:shd w:fill="F1F5F9"/>
+            <w:tcMar>
+              <w:top w:w="120" w:type="dxa"/>
+              <w:bottom w:w="120" w:type="dxa"/>
+              <w:left w:w="200" w:type="dxa"/>
+              <w:right w:w="200" w:type="dxa"/>
+            </w:tcMar>
+            <w:tcBorders>
+              <w:left w:val="single" w:sz="24" w:space="0" w:color="006B3C"/>
+              <w:top w:val="none"/>
+              <w:right w:val="none"/>
+              <w:bottom w:val="none"/>
+            </w:tcBorders>
+          </w:tcPr>
+          <w:p>
+            <w:pPr>
+              <w:spacing w:before="40" w:after="40" w:line="276" w:lineRule="auto"/>
+            </w:pPr>
+            <w:r>
+              <w:rPr>
+                <w:rFonts w:ascii="Consolas" w:hAnsi="Consolas"/>
+                <w:color w:val="1E293B"/>
+                <w:sz w:val="19"/>
+              </w:rPr>
+              <w:t xml:space="preserve">- **ที่มา**: เบราว์เซอร์ `http://localhost:5173/`  </w:t>
+            </w:r>
+          </w:p>
+        </w:tc>
+      </w:tr>
+    </w:tbl>
+    <w:tbl>
+      <w:tblPr>
+        <w:tblW w:type="auto" w:w="0"/>
+        <w:jc w:val="center"/>
+        <w:tblLook w:firstColumn="1" w:firstRow="1" w:lastColumn="0" w:lastRow="0" w:noHBand="0" w:noVBand="1" w:val="04A0"/>
+      </w:tblPr>
+      <w:tblGrid>
+        <w:gridCol w:w="9360"/>
+      </w:tblGrid>
+      <w:tr>
+        <w:tc>
+          <w:tcPr>
+            <w:tcW w:type="dxa" w:w="9360"/>
+            <w:shd w:fill="F1F5F9"/>
+            <w:tcMar>
+              <w:top w:w="120" w:type="dxa"/>
+              <w:bottom w:w="120" w:type="dxa"/>
+              <w:left w:w="200" w:type="dxa"/>
+              <w:right w:w="200" w:type="dxa"/>
+            </w:tcMar>
+            <w:tcBorders>
+              <w:left w:val="single" w:sz="24" w:space="0" w:color="006B3C"/>
+              <w:top w:val="none"/>
+              <w:right w:val="none"/>
+              <w:bottom w:val="none"/>
+            </w:tcBorders>
+          </w:tcPr>
+          <w:p>
+            <w:pPr>
+              <w:spacing w:before="40" w:after="40" w:line="276" w:lineRule="auto"/>
+            </w:pPr>
+            <w:r>
+              <w:rPr>
+                <w:rFonts w:ascii="Consolas" w:hAnsi="Consolas"/>
+                <w:color w:val="1E293B"/>
+                <w:sz w:val="19"/>
+              </w:rPr>
+              <w:t>- **พาธรูปภาพ**: `images/05_requester_selector.png`</w:t>
+            </w:r>
+          </w:p>
+        </w:tc>
+      </w:tr>
+    </w:tbl>
     <w:p>
       <w:pPr>
         <w:spacing w:before="120" w:after="120"/>
@@ -8232,6 +9406,178 @@
         <w:t>หน้าจอบันทึกตั๋วปัญหาแจ้งซ่อม IT มีเครื่องหมายดอกจันสีแดงแสดงฟิลด์บังคับ การดักจับ Validation Error และโซนอัปโหลดไฟล์แนบ</w:t>
       </w:r>
     </w:p>
+    <w:tbl>
+      <w:tblPr>
+        <w:tblW w:type="auto" w:w="0"/>
+        <w:jc w:val="center"/>
+        <w:tblLook w:firstColumn="1" w:firstRow="1" w:lastColumn="0" w:lastRow="0" w:noHBand="0" w:noVBand="1" w:val="04A0"/>
+      </w:tblPr>
+      <w:tblGrid>
+        <w:gridCol w:w="9360"/>
+      </w:tblGrid>
+      <w:tr>
+        <w:tc>
+          <w:tcPr>
+            <w:tcW w:type="dxa" w:w="9360"/>
+            <w:shd w:fill="F1F5F9"/>
+            <w:tcMar>
+              <w:top w:w="120" w:type="dxa"/>
+              <w:bottom w:w="120" w:type="dxa"/>
+              <w:left w:w="200" w:type="dxa"/>
+              <w:right w:w="200" w:type="dxa"/>
+            </w:tcMar>
+            <w:tcBorders>
+              <w:left w:val="single" w:sz="24" w:space="0" w:color="006B3C"/>
+              <w:top w:val="none"/>
+              <w:right w:val="none"/>
+              <w:bottom w:val="none"/>
+            </w:tcBorders>
+          </w:tcPr>
+          <w:p>
+            <w:pPr>
+              <w:spacing w:before="40" w:after="40" w:line="276" w:lineRule="auto"/>
+            </w:pPr>
+            <w:r>
+              <w:rPr>
+                <w:rFonts w:ascii="Consolas" w:hAnsi="Consolas"/>
+                <w:color w:val="1E293B"/>
+                <w:sz w:val="19"/>
+              </w:rPr>
+              <w:t xml:space="preserve">🖼️ **[กรอบสำหรับใส่รูปภาพที่ 6: Create Ticket Form UI]**  </w:t>
+            </w:r>
+          </w:p>
+        </w:tc>
+      </w:tr>
+    </w:tbl>
+    <w:tbl>
+      <w:tblPr>
+        <w:tblW w:type="auto" w:w="0"/>
+        <w:jc w:val="center"/>
+        <w:tblLook w:firstColumn="1" w:firstRow="1" w:lastColumn="0" w:lastRow="0" w:noHBand="0" w:noVBand="1" w:val="04A0"/>
+      </w:tblPr>
+      <w:tblGrid>
+        <w:gridCol w:w="9360"/>
+      </w:tblGrid>
+      <w:tr>
+        <w:tc>
+          <w:tcPr>
+            <w:tcW w:type="dxa" w:w="9360"/>
+            <w:shd w:fill="F1F5F9"/>
+            <w:tcMar>
+              <w:top w:w="120" w:type="dxa"/>
+              <w:bottom w:w="120" w:type="dxa"/>
+              <w:left w:w="200" w:type="dxa"/>
+              <w:right w:w="200" w:type="dxa"/>
+            </w:tcMar>
+            <w:tcBorders>
+              <w:left w:val="single" w:sz="24" w:space="0" w:color="006B3C"/>
+              <w:top w:val="none"/>
+              <w:right w:val="none"/>
+              <w:bottom w:val="none"/>
+            </w:tcBorders>
+          </w:tcPr>
+          <w:p>
+            <w:pPr>
+              <w:spacing w:before="40" w:after="40" w:line="276" w:lineRule="auto"/>
+            </w:pPr>
+            <w:r>
+              <w:rPr>
+                <w:rFonts w:ascii="Consolas" w:hAnsi="Consolas"/>
+                <w:color w:val="1E293B"/>
+                <w:sz w:val="19"/>
+              </w:rPr>
+              <w:t xml:space="preserve">- **คำอธิบาย**: หน้าจอบันทึกตั๋วปัญหาแจ้งซ่อม IT มีดอกจันสีแดงและฟิลด์อัปโหลดไฟล์  </w:t>
+            </w:r>
+          </w:p>
+        </w:tc>
+      </w:tr>
+    </w:tbl>
+    <w:tbl>
+      <w:tblPr>
+        <w:tblW w:type="auto" w:w="0"/>
+        <w:jc w:val="center"/>
+        <w:tblLook w:firstColumn="1" w:firstRow="1" w:lastColumn="0" w:lastRow="0" w:noHBand="0" w:noVBand="1" w:val="04A0"/>
+      </w:tblPr>
+      <w:tblGrid>
+        <w:gridCol w:w="9360"/>
+      </w:tblGrid>
+      <w:tr>
+        <w:tc>
+          <w:tcPr>
+            <w:tcW w:type="dxa" w:w="9360"/>
+            <w:shd w:fill="F1F5F9"/>
+            <w:tcMar>
+              <w:top w:w="120" w:type="dxa"/>
+              <w:bottom w:w="120" w:type="dxa"/>
+              <w:left w:w="200" w:type="dxa"/>
+              <w:right w:w="200" w:type="dxa"/>
+            </w:tcMar>
+            <w:tcBorders>
+              <w:left w:val="single" w:sz="24" w:space="0" w:color="006B3C"/>
+              <w:top w:val="none"/>
+              <w:right w:val="none"/>
+              <w:bottom w:val="none"/>
+            </w:tcBorders>
+          </w:tcPr>
+          <w:p>
+            <w:pPr>
+              <w:spacing w:before="40" w:after="40" w:line="276" w:lineRule="auto"/>
+            </w:pPr>
+            <w:r>
+              <w:rPr>
+                <w:rFonts w:ascii="Consolas" w:hAnsi="Consolas"/>
+                <w:color w:val="1E293B"/>
+                <w:sz w:val="19"/>
+              </w:rPr>
+              <w:t xml:space="preserve">- **ที่มา**: เบราว์เซอร์ `http://localhost:5173/` (กดปุ่ม Create Ticket)  </w:t>
+            </w:r>
+          </w:p>
+        </w:tc>
+      </w:tr>
+    </w:tbl>
+    <w:tbl>
+      <w:tblPr>
+        <w:tblW w:type="auto" w:w="0"/>
+        <w:jc w:val="center"/>
+        <w:tblLook w:firstColumn="1" w:firstRow="1" w:lastColumn="0" w:lastRow="0" w:noHBand="0" w:noVBand="1" w:val="04A0"/>
+      </w:tblPr>
+      <w:tblGrid>
+        <w:gridCol w:w="9360"/>
+      </w:tblGrid>
+      <w:tr>
+        <w:tc>
+          <w:tcPr>
+            <w:tcW w:type="dxa" w:w="9360"/>
+            <w:shd w:fill="F1F5F9"/>
+            <w:tcMar>
+              <w:top w:w="120" w:type="dxa"/>
+              <w:bottom w:w="120" w:type="dxa"/>
+              <w:left w:w="200" w:type="dxa"/>
+              <w:right w:w="200" w:type="dxa"/>
+            </w:tcMar>
+            <w:tcBorders>
+              <w:left w:val="single" w:sz="24" w:space="0" w:color="006B3C"/>
+              <w:top w:val="none"/>
+              <w:right w:val="none"/>
+              <w:bottom w:val="none"/>
+            </w:tcBorders>
+          </w:tcPr>
+          <w:p>
+            <w:pPr>
+              <w:spacing w:before="40" w:after="40" w:line="276" w:lineRule="auto"/>
+            </w:pPr>
+            <w:r>
+              <w:rPr>
+                <w:rFonts w:ascii="Consolas" w:hAnsi="Consolas"/>
+                <w:color w:val="1E293B"/>
+                <w:sz w:val="19"/>
+              </w:rPr>
+              <w:t>- **พาธรูปภาพ**: `images/06_create_ticket_form.png`</w:t>
+            </w:r>
+          </w:p>
+        </w:tc>
+      </w:tr>
+    </w:tbl>
     <w:p>
       <w:pPr>
         <w:spacing w:before="120" w:after="120"/>
@@ -8307,6 +9653,178 @@
         <w:t>หน้าจอแดชบอร์ดแสดงรายการตั๋วของผู้ใช้ มีช่องค้นหา ตัวกรองสถานะ/ความสำคัญ ตารางตั๋วพร้อม Badge สี และปุ่มเปลี่ยนหน้า (Pagination)</w:t>
       </w:r>
     </w:p>
+    <w:tbl>
+      <w:tblPr>
+        <w:tblW w:type="auto" w:w="0"/>
+        <w:jc w:val="center"/>
+        <w:tblLook w:firstColumn="1" w:firstRow="1" w:lastColumn="0" w:lastRow="0" w:noHBand="0" w:noVBand="1" w:val="04A0"/>
+      </w:tblPr>
+      <w:tblGrid>
+        <w:gridCol w:w="9360"/>
+      </w:tblGrid>
+      <w:tr>
+        <w:tc>
+          <w:tcPr>
+            <w:tcW w:type="dxa" w:w="9360"/>
+            <w:shd w:fill="F1F5F9"/>
+            <w:tcMar>
+              <w:top w:w="120" w:type="dxa"/>
+              <w:bottom w:w="120" w:type="dxa"/>
+              <w:left w:w="200" w:type="dxa"/>
+              <w:right w:w="200" w:type="dxa"/>
+            </w:tcMar>
+            <w:tcBorders>
+              <w:left w:val="single" w:sz="24" w:space="0" w:color="006B3C"/>
+              <w:top w:val="none"/>
+              <w:right w:val="none"/>
+              <w:bottom w:val="none"/>
+            </w:tcBorders>
+          </w:tcPr>
+          <w:p>
+            <w:pPr>
+              <w:spacing w:before="40" w:after="40" w:line="276" w:lineRule="auto"/>
+            </w:pPr>
+            <w:r>
+              <w:rPr>
+                <w:rFonts w:ascii="Consolas" w:hAnsi="Consolas"/>
+                <w:color w:val="1E293B"/>
+                <w:sz w:val="19"/>
+              </w:rPr>
+              <w:t xml:space="preserve">🖼️ **[กรอบสำหรับใส่รูปภาพที่ 7: My Tickets Dashboard]**  </w:t>
+            </w:r>
+          </w:p>
+        </w:tc>
+      </w:tr>
+    </w:tbl>
+    <w:tbl>
+      <w:tblPr>
+        <w:tblW w:type="auto" w:w="0"/>
+        <w:jc w:val="center"/>
+        <w:tblLook w:firstColumn="1" w:firstRow="1" w:lastColumn="0" w:lastRow="0" w:noHBand="0" w:noVBand="1" w:val="04A0"/>
+      </w:tblPr>
+      <w:tblGrid>
+        <w:gridCol w:w="9360"/>
+      </w:tblGrid>
+      <w:tr>
+        <w:tc>
+          <w:tcPr>
+            <w:tcW w:type="dxa" w:w="9360"/>
+            <w:shd w:fill="F1F5F9"/>
+            <w:tcMar>
+              <w:top w:w="120" w:type="dxa"/>
+              <w:bottom w:w="120" w:type="dxa"/>
+              <w:left w:w="200" w:type="dxa"/>
+              <w:right w:w="200" w:type="dxa"/>
+            </w:tcMar>
+            <w:tcBorders>
+              <w:left w:val="single" w:sz="24" w:space="0" w:color="006B3C"/>
+              <w:top w:val="none"/>
+              <w:right w:val="none"/>
+              <w:bottom w:val="none"/>
+            </w:tcBorders>
+          </w:tcPr>
+          <w:p>
+            <w:pPr>
+              <w:spacing w:before="40" w:after="40" w:line="276" w:lineRule="auto"/>
+            </w:pPr>
+            <w:r>
+              <w:rPr>
+                <w:rFonts w:ascii="Consolas" w:hAnsi="Consolas"/>
+                <w:color w:val="1E293B"/>
+                <w:sz w:val="19"/>
+              </w:rPr>
+              <w:t xml:space="preserve">- **คำอธิบาย**: หน้าจอแดชบอร์ดรายการตั๋วของผู้ใช้ มีตาราง ช่องค้นหา และตัวกรอง  </w:t>
+            </w:r>
+          </w:p>
+        </w:tc>
+      </w:tr>
+    </w:tbl>
+    <w:tbl>
+      <w:tblPr>
+        <w:tblW w:type="auto" w:w="0"/>
+        <w:jc w:val="center"/>
+        <w:tblLook w:firstColumn="1" w:firstRow="1" w:lastColumn="0" w:lastRow="0" w:noHBand="0" w:noVBand="1" w:val="04A0"/>
+      </w:tblPr>
+      <w:tblGrid>
+        <w:gridCol w:w="9360"/>
+      </w:tblGrid>
+      <w:tr>
+        <w:tc>
+          <w:tcPr>
+            <w:tcW w:type="dxa" w:w="9360"/>
+            <w:shd w:fill="F1F5F9"/>
+            <w:tcMar>
+              <w:top w:w="120" w:type="dxa"/>
+              <w:bottom w:w="120" w:type="dxa"/>
+              <w:left w:w="200" w:type="dxa"/>
+              <w:right w:w="200" w:type="dxa"/>
+            </w:tcMar>
+            <w:tcBorders>
+              <w:left w:val="single" w:sz="24" w:space="0" w:color="006B3C"/>
+              <w:top w:val="none"/>
+              <w:right w:val="none"/>
+              <w:bottom w:val="none"/>
+            </w:tcBorders>
+          </w:tcPr>
+          <w:p>
+            <w:pPr>
+              <w:spacing w:before="40" w:after="40" w:line="276" w:lineRule="auto"/>
+            </w:pPr>
+            <w:r>
+              <w:rPr>
+                <w:rFonts w:ascii="Consolas" w:hAnsi="Consolas"/>
+                <w:color w:val="1E293B"/>
+                <w:sz w:val="19"/>
+              </w:rPr>
+              <w:t xml:space="preserve">- **ที่มา**: เบราว์เซอร์ `http://localhost:5173/`  </w:t>
+            </w:r>
+          </w:p>
+        </w:tc>
+      </w:tr>
+    </w:tbl>
+    <w:tbl>
+      <w:tblPr>
+        <w:tblW w:type="auto" w:w="0"/>
+        <w:jc w:val="center"/>
+        <w:tblLook w:firstColumn="1" w:firstRow="1" w:lastColumn="0" w:lastRow="0" w:noHBand="0" w:noVBand="1" w:val="04A0"/>
+      </w:tblPr>
+      <w:tblGrid>
+        <w:gridCol w:w="9360"/>
+      </w:tblGrid>
+      <w:tr>
+        <w:tc>
+          <w:tcPr>
+            <w:tcW w:type="dxa" w:w="9360"/>
+            <w:shd w:fill="F1F5F9"/>
+            <w:tcMar>
+              <w:top w:w="120" w:type="dxa"/>
+              <w:bottom w:w="120" w:type="dxa"/>
+              <w:left w:w="200" w:type="dxa"/>
+              <w:right w:w="200" w:type="dxa"/>
+            </w:tcMar>
+            <w:tcBorders>
+              <w:left w:val="single" w:sz="24" w:space="0" w:color="006B3C"/>
+              <w:top w:val="none"/>
+              <w:right w:val="none"/>
+              <w:bottom w:val="none"/>
+            </w:tcBorders>
+          </w:tcPr>
+          <w:p>
+            <w:pPr>
+              <w:spacing w:before="40" w:after="40" w:line="276" w:lineRule="auto"/>
+            </w:pPr>
+            <w:r>
+              <w:rPr>
+                <w:rFonts w:ascii="Consolas" w:hAnsi="Consolas"/>
+                <w:color w:val="1E293B"/>
+                <w:sz w:val="19"/>
+              </w:rPr>
+              <w:t>- **พาธรูปภาพ**: `images/07_my_tickets_dashboard.png`</w:t>
+            </w:r>
+          </w:p>
+        </w:tc>
+      </w:tr>
+    </w:tbl>
     <w:p>
       <w:pPr>
         <w:spacing w:before="120" w:after="120"/>
@@ -8382,6 +9900,178 @@
         <w:t>หน้าจอแสดงรายละเอียดตั๋วแบบ Read-Only รายการไฟล์แนบ ปุ่มอัปโหลดไฟล์เพิ่ม และระบบ Soft-remove พร้อมกรอกเหตุผลในการลบ</w:t>
       </w:r>
     </w:p>
+    <w:tbl>
+      <w:tblPr>
+        <w:tblW w:type="auto" w:w="0"/>
+        <w:jc w:val="center"/>
+        <w:tblLook w:firstColumn="1" w:firstRow="1" w:lastColumn="0" w:lastRow="0" w:noHBand="0" w:noVBand="1" w:val="04A0"/>
+      </w:tblPr>
+      <w:tblGrid>
+        <w:gridCol w:w="9360"/>
+      </w:tblGrid>
+      <w:tr>
+        <w:tc>
+          <w:tcPr>
+            <w:tcW w:type="dxa" w:w="9360"/>
+            <w:shd w:fill="F1F5F9"/>
+            <w:tcMar>
+              <w:top w:w="120" w:type="dxa"/>
+              <w:bottom w:w="120" w:type="dxa"/>
+              <w:left w:w="200" w:type="dxa"/>
+              <w:right w:w="200" w:type="dxa"/>
+            </w:tcMar>
+            <w:tcBorders>
+              <w:left w:val="single" w:sz="24" w:space="0" w:color="006B3C"/>
+              <w:top w:val="none"/>
+              <w:right w:val="none"/>
+              <w:bottom w:val="none"/>
+            </w:tcBorders>
+          </w:tcPr>
+          <w:p>
+            <w:pPr>
+              <w:spacing w:before="40" w:after="40" w:line="276" w:lineRule="auto"/>
+            </w:pPr>
+            <w:r>
+              <w:rPr>
+                <w:rFonts w:ascii="Consolas" w:hAnsi="Consolas"/>
+                <w:color w:val="1E293B"/>
+                <w:sz w:val="19"/>
+              </w:rPr>
+              <w:t xml:space="preserve">🖼️ **[กรอบสำหรับใส่รูปภาพที่ 8: Ticket Detail &amp; Attachment Soft Removal Modal]**  </w:t>
+            </w:r>
+          </w:p>
+        </w:tc>
+      </w:tr>
+    </w:tbl>
+    <w:tbl>
+      <w:tblPr>
+        <w:tblW w:type="auto" w:w="0"/>
+        <w:jc w:val="center"/>
+        <w:tblLook w:firstColumn="1" w:firstRow="1" w:lastColumn="0" w:lastRow="0" w:noHBand="0" w:noVBand="1" w:val="04A0"/>
+      </w:tblPr>
+      <w:tblGrid>
+        <w:gridCol w:w="9360"/>
+      </w:tblGrid>
+      <w:tr>
+        <w:tc>
+          <w:tcPr>
+            <w:tcW w:type="dxa" w:w="9360"/>
+            <w:shd w:fill="F1F5F9"/>
+            <w:tcMar>
+              <w:top w:w="120" w:type="dxa"/>
+              <w:bottom w:w="120" w:type="dxa"/>
+              <w:left w:w="200" w:type="dxa"/>
+              <w:right w:w="200" w:type="dxa"/>
+            </w:tcMar>
+            <w:tcBorders>
+              <w:left w:val="single" w:sz="24" w:space="0" w:color="006B3C"/>
+              <w:top w:val="none"/>
+              <w:right w:val="none"/>
+              <w:bottom w:val="none"/>
+            </w:tcBorders>
+          </w:tcPr>
+          <w:p>
+            <w:pPr>
+              <w:spacing w:before="40" w:after="40" w:line="276" w:lineRule="auto"/>
+            </w:pPr>
+            <w:r>
+              <w:rPr>
+                <w:rFonts w:ascii="Consolas" w:hAnsi="Consolas"/>
+                <w:color w:val="1E293B"/>
+                <w:sz w:val="19"/>
+              </w:rPr>
+              <w:t xml:space="preserve">- **คำอธิบาย**: หน้าจอรายละเอียดตั๋ว Read-Only และ Modal ป๊อปอัปกรอกเหตุผลลบไฟล์แนบ  </w:t>
+            </w:r>
+          </w:p>
+        </w:tc>
+      </w:tr>
+    </w:tbl>
+    <w:tbl>
+      <w:tblPr>
+        <w:tblW w:type="auto" w:w="0"/>
+        <w:jc w:val="center"/>
+        <w:tblLook w:firstColumn="1" w:firstRow="1" w:lastColumn="0" w:lastRow="0" w:noHBand="0" w:noVBand="1" w:val="04A0"/>
+      </w:tblPr>
+      <w:tblGrid>
+        <w:gridCol w:w="9360"/>
+      </w:tblGrid>
+      <w:tr>
+        <w:tc>
+          <w:tcPr>
+            <w:tcW w:type="dxa" w:w="9360"/>
+            <w:shd w:fill="F1F5F9"/>
+            <w:tcMar>
+              <w:top w:w="120" w:type="dxa"/>
+              <w:bottom w:w="120" w:type="dxa"/>
+              <w:left w:w="200" w:type="dxa"/>
+              <w:right w:w="200" w:type="dxa"/>
+            </w:tcMar>
+            <w:tcBorders>
+              <w:left w:val="single" w:sz="24" w:space="0" w:color="006B3C"/>
+              <w:top w:val="none"/>
+              <w:right w:val="none"/>
+              <w:bottom w:val="none"/>
+            </w:tcBorders>
+          </w:tcPr>
+          <w:p>
+            <w:pPr>
+              <w:spacing w:before="40" w:after="40" w:line="276" w:lineRule="auto"/>
+            </w:pPr>
+            <w:r>
+              <w:rPr>
+                <w:rFonts w:ascii="Consolas" w:hAnsi="Consolas"/>
+                <w:color w:val="1E293B"/>
+                <w:sz w:val="19"/>
+              </w:rPr>
+              <w:t xml:space="preserve">- **ที่มา**: เบราว์เซอร์ `http://localhost:5173/` (คลิกเปิดตั๋วแล้วกด Remove ไฟล์แนบ)  </w:t>
+            </w:r>
+          </w:p>
+        </w:tc>
+      </w:tr>
+    </w:tbl>
+    <w:tbl>
+      <w:tblPr>
+        <w:tblW w:type="auto" w:w="0"/>
+        <w:jc w:val="center"/>
+        <w:tblLook w:firstColumn="1" w:firstRow="1" w:lastColumn="0" w:lastRow="0" w:noHBand="0" w:noVBand="1" w:val="04A0"/>
+      </w:tblPr>
+      <w:tblGrid>
+        <w:gridCol w:w="9360"/>
+      </w:tblGrid>
+      <w:tr>
+        <w:tc>
+          <w:tcPr>
+            <w:tcW w:type="dxa" w:w="9360"/>
+            <w:shd w:fill="F1F5F9"/>
+            <w:tcMar>
+              <w:top w:w="120" w:type="dxa"/>
+              <w:bottom w:w="120" w:type="dxa"/>
+              <w:left w:w="200" w:type="dxa"/>
+              <w:right w:w="200" w:type="dxa"/>
+            </w:tcMar>
+            <w:tcBorders>
+              <w:left w:val="single" w:sz="24" w:space="0" w:color="006B3C"/>
+              <w:top w:val="none"/>
+              <w:right w:val="none"/>
+              <w:bottom w:val="none"/>
+            </w:tcBorders>
+          </w:tcPr>
+          <w:p>
+            <w:pPr>
+              <w:spacing w:before="40" w:after="40" w:line="276" w:lineRule="auto"/>
+            </w:pPr>
+            <w:r>
+              <w:rPr>
+                <w:rFonts w:ascii="Consolas" w:hAnsi="Consolas"/>
+                <w:color w:val="1E293B"/>
+                <w:sz w:val="19"/>
+              </w:rPr>
+              <w:t>- **พาธรูปภาพ**: `images/08_ticket_detail_modal.png`</w:t>
+            </w:r>
+          </w:p>
+        </w:tc>
+      </w:tr>
+    </w:tbl>
     <w:p>
       <w:pPr>
         <w:spacing w:before="120" w:after="120"/>

</xml_diff>

<commit_message>
docs(report): update section 8 GitHub Peer Review Evidence formatting
</commit_message>
<xml_diff>
--- a/docs/lab-02/LAB2_SUBMISSION_REPORT_UPDATED.docx
+++ b/docs/lab-02/LAB2_SUBMISSION_REPORT_UPDATED.docx
@@ -3124,7 +3124,22 @@
           <w:color w:val="1E293B"/>
           <w:sz w:val="26"/>
         </w:rPr>
-        <w:t>8. GitHub Peer Review Evidence</w:t>
+        <w:t>8. GitHub Peer Review Evidence (หลักฐานการรีวิวโค้ดระหว่างคู่รีวิว)</w:t>
+      </w:r>
+    </w:p>
+    <w:p>
+      <w:pPr>
+        <w:pStyle w:val="Heading3"/>
+        <w:spacing w:before="200" w:after="40"/>
+      </w:pPr>
+      <w:r>
+        <w:rPr>
+          <w:rFonts w:ascii="Arial" w:hAnsi="Arial"/>
+          <w:b/>
+          <w:color w:val="475569"/>
+          <w:sz w:val="22"/>
+        </w:rPr>
+        <w:t>8.1 Peer Review Evidence on My Repository (หลักฐานที่เพื่อน @Suprawi5227 มาตรวจรีวิวและกด Approve ให้เรา)</w:t>
       </w:r>
     </w:p>
     <w:tbl>
@@ -3207,7 +3222,7 @@
                 <w:color w:val="1E293B"/>
                 <w:sz w:val="19"/>
               </w:rPr>
-              <w:t xml:space="preserve">- **คำอธิบาย**: หน้าจอ Pull Request บน GitHub ของเราที่สุประวีณ์เข้ามารีวิวและกด Approve  </w:t>
+              <w:t xml:space="preserve">- **คำอธิบาย**: หน้าจอ Pull Request บน GitHub ของเราที่สุประวีณ์ (@Suprawi5227) เข้ามารีวิวและกด Approve  </w:t>
             </w:r>
           </w:p>
         </w:tc>
@@ -3250,7 +3265,7 @@
                 <w:color w:val="1E293B"/>
                 <w:sz w:val="19"/>
               </w:rPr>
-              <w:t xml:space="preserve">- **ที่มา**: [https://github.com/natthakamol1130/toktickit/pulls](https://github.com/natthakamol1130/toktickit/pulls)  </w:t>
+              <w:t xml:space="preserve">- **ที่มา**: [https://github.com/natthakamol1130/toktickit/pulls](https://github.com/natthakamol1130/toktickit/pulls) (เลือก PR #33 หรือ PR #32)  </w:t>
             </w:r>
           </w:p>
         </w:tc>
@@ -3339,6 +3354,29 @@
         </w:drawing>
       </w:r>
     </w:p>
+    <w:p>
+      <w:pPr>
+        <w:spacing w:before="120" w:after="120"/>
+        <w:pBdr>
+          <w:bottom w:val="single" w:sz="6" w:space="1" w:color="CBD5E1"/>
+        </w:pBdr>
+      </w:pPr>
+    </w:p>
+    <w:p>
+      <w:pPr>
+        <w:pStyle w:val="Heading3"/>
+        <w:spacing w:before="200" w:after="40"/>
+      </w:pPr>
+      <w:r>
+        <w:rPr>
+          <w:rFonts w:ascii="Arial" w:hAnsi="Arial"/>
+          <w:b/>
+          <w:color w:val="475569"/>
+          <w:sz w:val="22"/>
+        </w:rPr>
+        <w:t>8.2 Peer Review Evidence on Peer Repository (หลักฐานที่เรา @natthakamol1130 ไปตรวจรีวิวและกด Approve ให้เพื่อน)</w:t>
+      </w:r>
+    </w:p>
     <w:tbl>
       <w:tblPr>
         <w:tblW w:type="auto" w:w="0"/>
@@ -3419,7 +3457,7 @@
                 <w:color w:val="1E293B"/>
                 <w:sz w:val="19"/>
               </w:rPr>
-              <w:t xml:space="preserve">- **คำอธิบาย**: หน้าจอ Pull Request บน GitHub ของเพื่อนที่เราเข้าไปตรวจและกด Approve  </w:t>
+              <w:t xml:space="preserve">- **คำอธิบาย**: หน้าจอ Pull Request บน GitHub ของเพื่อนที่คุณเข้าไปตรวจโค้ดและกด Approve  </w:t>
             </w:r>
           </w:p>
         </w:tc>
@@ -3462,7 +3500,7 @@
                 <w:color w:val="1E293B"/>
                 <w:sz w:val="19"/>
               </w:rPr>
-              <w:t xml:space="preserve">- **ที่มา**: Repository ของเพื่อน (`Suprawi5227/toktickit`)  </w:t>
+              <w:t xml:space="preserve">- **ที่มา**: GitHub Repository ของเพื่อน (`Suprawi5227/toktickit`)  </w:t>
             </w:r>
           </w:p>
         </w:tc>

</xml_diff>

<commit_message>
docs(report): format peer review comments neatly in report docs
</commit_message>
<xml_diff>
--- a/docs/lab-02/LAB2_SUBMISSION_REPORT_UPDATED.docx
+++ b/docs/lab-02/LAB2_SUBMISSION_REPORT_UPDATED.docx
@@ -3124,7 +3124,7 @@
           <w:color w:val="1E293B"/>
           <w:sz w:val="26"/>
         </w:rPr>
-        <w:t>8. GitHub Peer Review Evidence (หลักฐานการรีวิวโค้ดระหว่างคู่รีวิว)</w:t>
+        <w:t>8. GitHub Peer Review Evidence (หลักฐานข้อความและการรีวิวโค้ดระหว่างคู่รีวิว)</w:t>
       </w:r>
     </w:p>
     <w:p>
@@ -3139,9 +3139,245 @@
           <w:color w:val="475569"/>
           <w:sz w:val="22"/>
         </w:rPr>
-        <w:t>8.1 Peer Review Evidence on My Repository (หลักฐานที่เพื่อน @Suprawi5227 มาตรวจรีวิวและกด Approve ให้เรา)</w:t>
+        <w:t>8.1 Peer Review Received on My Repository (หลักฐานที่เพื่อน @Suprawi5227 มาตรวจรีวิวและกด Approve ให้เรา)</w:t>
       </w:r>
     </w:p>
+    <w:p>
+      <w:pPr>
+        <w:pStyle w:val="ListBullet"/>
+        <w:spacing w:before="0" w:after="60"/>
+      </w:pPr>
+      <w:r>
+        <w:rPr>
+          <w:rFonts w:ascii="Arial" w:hAnsi="Arial"/>
+          <w:b/>
+          <w:sz w:val="20"/>
+        </w:rPr>
+        <w:t>Target Repository</w:t>
+      </w:r>
+      <w:r>
+        <w:rPr>
+          <w:rFonts w:ascii="Arial" w:hAnsi="Arial"/>
+          <w:sz w:val="20"/>
+        </w:rPr>
+        <w:t xml:space="preserve">: </w:t>
+      </w:r>
+      <w:r>
+        <w:rPr>
+          <w:rFonts w:ascii="Arial" w:hAnsi="Arial"/>
+          <w:color w:val="006B3C"/>
+          <w:sz w:val="20"/>
+        </w:rPr>
+        <w:t>natthakamol1130/toktickit</w:t>
+      </w:r>
+    </w:p>
+    <w:p>
+      <w:pPr>
+        <w:pStyle w:val="ListBullet"/>
+        <w:spacing w:before="0" w:after="60"/>
+      </w:pPr>
+      <w:r>
+        <w:rPr>
+          <w:rFonts w:ascii="Arial" w:hAnsi="Arial"/>
+          <w:b/>
+          <w:sz w:val="20"/>
+        </w:rPr>
+        <w:t>ผู้รีวิว (Reviewer)</w:t>
+      </w:r>
+      <w:r>
+        <w:rPr>
+          <w:rFonts w:ascii="Arial" w:hAnsi="Arial"/>
+          <w:sz w:val="20"/>
+        </w:rPr>
+        <w:t>: นางสาวสุประวีณ์ สุทธิเสรีนิวัมน์ (</w:t>
+      </w:r>
+      <w:r>
+        <w:rPr>
+          <w:rFonts w:ascii="Arial" w:hAnsi="Arial"/>
+          <w:color w:val="006B3C"/>
+          <w:sz w:val="20"/>
+        </w:rPr>
+        <w:t>@Suprawi5227</w:t>
+      </w:r>
+      <w:r>
+        <w:rPr>
+          <w:rFonts w:ascii="Arial" w:hAnsi="Arial"/>
+          <w:sz w:val="20"/>
+        </w:rPr>
+        <w:t xml:space="preserve"> / 67070505227)</w:t>
+      </w:r>
+    </w:p>
+    <w:p>
+      <w:pPr>
+        <w:pStyle w:val="ListBullet"/>
+        <w:spacing w:before="0" w:after="60"/>
+      </w:pPr>
+      <w:r>
+        <w:rPr>
+          <w:rFonts w:ascii="Arial" w:hAnsi="Arial"/>
+          <w:b/>
+          <w:sz w:val="20"/>
+        </w:rPr>
+        <w:t>ผู้พัฒนา (Author)</w:t>
+      </w:r>
+      <w:r>
+        <w:rPr>
+          <w:rFonts w:ascii="Arial" w:hAnsi="Arial"/>
+          <w:sz w:val="20"/>
+        </w:rPr>
+        <w:t>: นางสาวณัฏฐกมล มอญปาน (</w:t>
+      </w:r>
+      <w:r>
+        <w:rPr>
+          <w:rFonts w:ascii="Arial" w:hAnsi="Arial"/>
+          <w:color w:val="006B3C"/>
+          <w:sz w:val="20"/>
+        </w:rPr>
+        <w:t>@natthakamol1130</w:t>
+      </w:r>
+      <w:r>
+        <w:rPr>
+          <w:rFonts w:ascii="Arial" w:hAnsi="Arial"/>
+          <w:sz w:val="20"/>
+        </w:rPr>
+        <w:t xml:space="preserve"> / 67070505215)</w:t>
+      </w:r>
+    </w:p>
+    <w:p>
+      <w:pPr>
+        <w:pStyle w:val="ListBullet"/>
+        <w:spacing w:before="0" w:after="60"/>
+      </w:pPr>
+      <w:r>
+        <w:rPr>
+          <w:rFonts w:ascii="Arial" w:hAnsi="Arial"/>
+          <w:b/>
+          <w:sz w:val="20"/>
+        </w:rPr>
+        <w:t>สถานะการรีวิว (Status)</w:t>
+      </w:r>
+      <w:r>
+        <w:rPr>
+          <w:rFonts w:ascii="Arial" w:hAnsi="Arial"/>
+          <w:sz w:val="20"/>
+        </w:rPr>
+        <w:t xml:space="preserve">: </w:t>
+      </w:r>
+      <w:r>
+        <w:rPr>
+          <w:rFonts w:ascii="Arial" w:hAnsi="Arial"/>
+          <w:color w:val="006B3C"/>
+          <w:sz w:val="20"/>
+        </w:rPr>
+        <w:t>Approved</w:t>
+      </w:r>
+      <w:r>
+        <w:rPr>
+          <w:rFonts w:ascii="Arial" w:hAnsi="Arial"/>
+          <w:sz w:val="20"/>
+        </w:rPr>
+        <w:t xml:space="preserve"> (ผ่านการรีวิวและอนุมัติให้ Merge)</w:t>
+      </w:r>
+    </w:p>
+    <w:p>
+      <w:pPr>
+        <w:spacing w:before="0" w:after="80" w:line="276" w:lineRule="auto"/>
+      </w:pPr>
+      <w:r>
+        <w:rPr>
+          <w:rFonts w:ascii="Arial" w:hAnsi="Arial"/>
+          <w:b/>
+          <w:sz w:val="20"/>
+        </w:rPr>
+        <w:t>ข้อความความคิดเห็นการรีวิวใน Final Release PR #33 (`lab2-staging` -&gt; `main`):</w:t>
+      </w:r>
+    </w:p>
+    <w:tbl>
+      <w:tblPr>
+        <w:tblW w:type="auto" w:w="0"/>
+        <w:jc w:val="center"/>
+        <w:tblLook w:firstColumn="1" w:firstRow="1" w:lastColumn="0" w:lastRow="0" w:noHBand="0" w:noVBand="1" w:val="04A0"/>
+      </w:tblPr>
+      <w:tblGrid>
+        <w:gridCol w:w="9360"/>
+      </w:tblGrid>
+      <w:tr>
+        <w:tc>
+          <w:tcPr>
+            <w:tcW w:type="dxa" w:w="9360"/>
+            <w:shd w:fill="F1F5F9"/>
+            <w:tcMar>
+              <w:top w:w="120" w:type="dxa"/>
+              <w:bottom w:w="120" w:type="dxa"/>
+              <w:left w:w="200" w:type="dxa"/>
+              <w:right w:w="200" w:type="dxa"/>
+            </w:tcMar>
+            <w:tcBorders>
+              <w:left w:val="single" w:sz="24" w:space="0" w:color="006B3C"/>
+              <w:top w:val="none"/>
+              <w:right w:val="none"/>
+              <w:bottom w:val="none"/>
+            </w:tcBorders>
+          </w:tcPr>
+          <w:p>
+            <w:pPr>
+              <w:spacing w:before="40" w:after="40" w:line="276" w:lineRule="auto"/>
+            </w:pPr>
+            <w:r>
+              <w:rPr>
+                <w:rFonts w:ascii="Consolas" w:hAnsi="Consolas"/>
+                <w:color w:val="1E293B"/>
+                <w:sz w:val="19"/>
+              </w:rPr>
+              <w:t xml:space="preserve">**Reviewer Verdict: Approved**  </w:t>
+            </w:r>
+          </w:p>
+        </w:tc>
+      </w:tr>
+    </w:tbl>
+    <w:tbl>
+      <w:tblPr>
+        <w:tblW w:type="auto" w:w="0"/>
+        <w:jc w:val="center"/>
+        <w:tblLook w:firstColumn="1" w:firstRow="1" w:lastColumn="0" w:lastRow="0" w:noHBand="0" w:noVBand="1" w:val="04A0"/>
+      </w:tblPr>
+      <w:tblGrid>
+        <w:gridCol w:w="9360"/>
+      </w:tblGrid>
+      <w:tr>
+        <w:tc>
+          <w:tcPr>
+            <w:tcW w:type="dxa" w:w="9360"/>
+            <w:shd w:fill="F1F5F9"/>
+            <w:tcMar>
+              <w:top w:w="120" w:type="dxa"/>
+              <w:bottom w:w="120" w:type="dxa"/>
+              <w:left w:w="200" w:type="dxa"/>
+              <w:right w:w="200" w:type="dxa"/>
+            </w:tcMar>
+            <w:tcBorders>
+              <w:left w:val="single" w:sz="24" w:space="0" w:color="006B3C"/>
+              <w:top w:val="none"/>
+              <w:right w:val="none"/>
+              <w:bottom w:val="none"/>
+            </w:tcBorders>
+          </w:tcPr>
+          <w:p>
+            <w:pPr>
+              <w:spacing w:before="40" w:after="40" w:line="276" w:lineRule="auto"/>
+            </w:pPr>
+            <w:r>
+              <w:rPr>
+                <w:rFonts w:ascii="Consolas" w:hAnsi="Consolas"/>
+                <w:color w:val="1E293B"/>
+                <w:sz w:val="19"/>
+              </w:rPr>
+              <w:t>"ตรวจสอบโค้ดและผลการทดสอบเรียบร้อยแล้วค่ะ โครงสร้างระบบ Spec DD, REST API, และ UI Zen Green ตรงตามข้อกำหนด Specification Contract ครบถ้วนทุกข้อ อนุมัติให้ Merge เข้าสาขา main ได้ค่ะ!"</w:t>
+            </w:r>
+          </w:p>
+        </w:tc>
+      </w:tr>
+    </w:tbl>
     <w:tbl>
       <w:tblPr>
         <w:tblW w:type="auto" w:w="0"/>
@@ -3374,9 +3610,245 @@
           <w:color w:val="475569"/>
           <w:sz w:val="22"/>
         </w:rPr>
-        <w:t>8.2 Peer Review Evidence on Peer Repository (หลักฐานที่เรา @natthakamol1130 ไปตรวจรีวิวและกด Approve ให้เพื่อน)</w:t>
+        <w:t>8.2 Peer Review Given on Peer Repository (หลักฐานที่เรา @natthakamol1130 ไปตรวจรีวิวและกด Approve ให้เพื่อน)</w:t>
       </w:r>
     </w:p>
+    <w:p>
+      <w:pPr>
+        <w:pStyle w:val="ListBullet"/>
+        <w:spacing w:before="0" w:after="60"/>
+      </w:pPr>
+      <w:r>
+        <w:rPr>
+          <w:rFonts w:ascii="Arial" w:hAnsi="Arial"/>
+          <w:b/>
+          <w:sz w:val="20"/>
+        </w:rPr>
+        <w:t>Target Repository</w:t>
+      </w:r>
+      <w:r>
+        <w:rPr>
+          <w:rFonts w:ascii="Arial" w:hAnsi="Arial"/>
+          <w:sz w:val="20"/>
+        </w:rPr>
+        <w:t xml:space="preserve">: </w:t>
+      </w:r>
+      <w:r>
+        <w:rPr>
+          <w:rFonts w:ascii="Arial" w:hAnsi="Arial"/>
+          <w:color w:val="006B3C"/>
+          <w:sz w:val="20"/>
+        </w:rPr>
+        <w:t>Suprawi5227/toktickit</w:t>
+      </w:r>
+    </w:p>
+    <w:p>
+      <w:pPr>
+        <w:pStyle w:val="ListBullet"/>
+        <w:spacing w:before="0" w:after="60"/>
+      </w:pPr>
+      <w:r>
+        <w:rPr>
+          <w:rFonts w:ascii="Arial" w:hAnsi="Arial"/>
+          <w:b/>
+          <w:sz w:val="20"/>
+        </w:rPr>
+        <w:t>ผู้รีวิว (Reviewer)</w:t>
+      </w:r>
+      <w:r>
+        <w:rPr>
+          <w:rFonts w:ascii="Arial" w:hAnsi="Arial"/>
+          <w:sz w:val="20"/>
+        </w:rPr>
+        <w:t>: นางสาวณัฏฐกมล มอญปาน (</w:t>
+      </w:r>
+      <w:r>
+        <w:rPr>
+          <w:rFonts w:ascii="Arial" w:hAnsi="Arial"/>
+          <w:color w:val="006B3C"/>
+          <w:sz w:val="20"/>
+        </w:rPr>
+        <w:t>@natthakamol1130</w:t>
+      </w:r>
+      <w:r>
+        <w:rPr>
+          <w:rFonts w:ascii="Arial" w:hAnsi="Arial"/>
+          <w:sz w:val="20"/>
+        </w:rPr>
+        <w:t xml:space="preserve"> / 67070505215)</w:t>
+      </w:r>
+    </w:p>
+    <w:p>
+      <w:pPr>
+        <w:pStyle w:val="ListBullet"/>
+        <w:spacing w:before="0" w:after="60"/>
+      </w:pPr>
+      <w:r>
+        <w:rPr>
+          <w:rFonts w:ascii="Arial" w:hAnsi="Arial"/>
+          <w:b/>
+          <w:sz w:val="20"/>
+        </w:rPr>
+        <w:t>ผู้พัฒนา (Author)</w:t>
+      </w:r>
+      <w:r>
+        <w:rPr>
+          <w:rFonts w:ascii="Arial" w:hAnsi="Arial"/>
+          <w:sz w:val="20"/>
+        </w:rPr>
+        <w:t>: นางสาวสุประวีณ์ สุทธิเสรีนิวัมน์ (</w:t>
+      </w:r>
+      <w:r>
+        <w:rPr>
+          <w:rFonts w:ascii="Arial" w:hAnsi="Arial"/>
+          <w:color w:val="006B3C"/>
+          <w:sz w:val="20"/>
+        </w:rPr>
+        <w:t>@Suprawi5227</w:t>
+      </w:r>
+      <w:r>
+        <w:rPr>
+          <w:rFonts w:ascii="Arial" w:hAnsi="Arial"/>
+          <w:sz w:val="20"/>
+        </w:rPr>
+        <w:t xml:space="preserve"> / 67070505227)</w:t>
+      </w:r>
+    </w:p>
+    <w:p>
+      <w:pPr>
+        <w:pStyle w:val="ListBullet"/>
+        <w:spacing w:before="0" w:after="60"/>
+      </w:pPr>
+      <w:r>
+        <w:rPr>
+          <w:rFonts w:ascii="Arial" w:hAnsi="Arial"/>
+          <w:b/>
+          <w:sz w:val="20"/>
+        </w:rPr>
+        <w:t>สถานะการรีวิว (Status)</w:t>
+      </w:r>
+      <w:r>
+        <w:rPr>
+          <w:rFonts w:ascii="Arial" w:hAnsi="Arial"/>
+          <w:sz w:val="20"/>
+        </w:rPr>
+        <w:t xml:space="preserve">: </w:t>
+      </w:r>
+      <w:r>
+        <w:rPr>
+          <w:rFonts w:ascii="Arial" w:hAnsi="Arial"/>
+          <w:color w:val="006B3C"/>
+          <w:sz w:val="20"/>
+        </w:rPr>
+        <w:t>Approved</w:t>
+      </w:r>
+      <w:r>
+        <w:rPr>
+          <w:rFonts w:ascii="Arial" w:hAnsi="Arial"/>
+          <w:sz w:val="20"/>
+        </w:rPr>
+        <w:t xml:space="preserve"> (ผ่านการรีวิวและอนุมัติให้ Merge)</w:t>
+      </w:r>
+    </w:p>
+    <w:p>
+      <w:pPr>
+        <w:spacing w:before="0" w:after="80" w:line="276" w:lineRule="auto"/>
+      </w:pPr>
+      <w:r>
+        <w:rPr>
+          <w:rFonts w:ascii="Arial" w:hAnsi="Arial"/>
+          <w:b/>
+          <w:sz w:val="20"/>
+        </w:rPr>
+        <w:t>ข้อความความคิดเห็นการรีวิวใน Release PR ของเพื่อน (`lab2-staging` -&gt; `main`):</w:t>
+      </w:r>
+    </w:p>
+    <w:tbl>
+      <w:tblPr>
+        <w:tblW w:type="auto" w:w="0"/>
+        <w:jc w:val="center"/>
+        <w:tblLook w:firstColumn="1" w:firstRow="1" w:lastColumn="0" w:lastRow="0" w:noHBand="0" w:noVBand="1" w:val="04A0"/>
+      </w:tblPr>
+      <w:tblGrid>
+        <w:gridCol w:w="9360"/>
+      </w:tblGrid>
+      <w:tr>
+        <w:tc>
+          <w:tcPr>
+            <w:tcW w:type="dxa" w:w="9360"/>
+            <w:shd w:fill="F1F5F9"/>
+            <w:tcMar>
+              <w:top w:w="120" w:type="dxa"/>
+              <w:bottom w:w="120" w:type="dxa"/>
+              <w:left w:w="200" w:type="dxa"/>
+              <w:right w:w="200" w:type="dxa"/>
+            </w:tcMar>
+            <w:tcBorders>
+              <w:left w:val="single" w:sz="24" w:space="0" w:color="006B3C"/>
+              <w:top w:val="none"/>
+              <w:right w:val="none"/>
+              <w:bottom w:val="none"/>
+            </w:tcBorders>
+          </w:tcPr>
+          <w:p>
+            <w:pPr>
+              <w:spacing w:before="40" w:after="40" w:line="276" w:lineRule="auto"/>
+            </w:pPr>
+            <w:r>
+              <w:rPr>
+                <w:rFonts w:ascii="Consolas" w:hAnsi="Consolas"/>
+                <w:color w:val="1E293B"/>
+                <w:sz w:val="19"/>
+              </w:rPr>
+              <w:t xml:space="preserve">**Reviewer Verdict: Approved**  </w:t>
+            </w:r>
+          </w:p>
+        </w:tc>
+      </w:tr>
+    </w:tbl>
+    <w:tbl>
+      <w:tblPr>
+        <w:tblW w:type="auto" w:w="0"/>
+        <w:jc w:val="center"/>
+        <w:tblLook w:firstColumn="1" w:firstRow="1" w:lastColumn="0" w:lastRow="0" w:noHBand="0" w:noVBand="1" w:val="04A0"/>
+      </w:tblPr>
+      <w:tblGrid>
+        <w:gridCol w:w="9360"/>
+      </w:tblGrid>
+      <w:tr>
+        <w:tc>
+          <w:tcPr>
+            <w:tcW w:type="dxa" w:w="9360"/>
+            <w:shd w:fill="F1F5F9"/>
+            <w:tcMar>
+              <w:top w:w="120" w:type="dxa"/>
+              <w:bottom w:w="120" w:type="dxa"/>
+              <w:left w:w="200" w:type="dxa"/>
+              <w:right w:w="200" w:type="dxa"/>
+            </w:tcMar>
+            <w:tcBorders>
+              <w:left w:val="single" w:sz="24" w:space="0" w:color="006B3C"/>
+              <w:top w:val="none"/>
+              <w:right w:val="none"/>
+              <w:bottom w:val="none"/>
+            </w:tcBorders>
+          </w:tcPr>
+          <w:p>
+            <w:pPr>
+              <w:spacing w:before="40" w:after="40" w:line="276" w:lineRule="auto"/>
+            </w:pPr>
+            <w:r>
+              <w:rPr>
+                <w:rFonts w:ascii="Consolas" w:hAnsi="Consolas"/>
+                <w:color w:val="1E293B"/>
+                <w:sz w:val="19"/>
+              </w:rPr>
+              <w:t>"ตรวจทานโค้ดและทดสอบการทำงานของระบบฝั่งเพื่อนเรียบร้อยแล้วค่ะ การทำงานถูกต้องตาม Spec และผ่านการทดสอบ E2E และ Unit Test อนุมัติให้ Merge เรียบร้อยค่ะ"</w:t>
+            </w:r>
+          </w:p>
+        </w:tc>
+      </w:tr>
+    </w:tbl>
     <w:tbl>
       <w:tblPr>
         <w:tblW w:type="auto" w:w="0"/>

</xml_diff>